<commit_message>
Draft_123_body: fix table thick bottoms and Measure label
Overwrite only. Last-row bottom nil was suppressing outer border.
</commit_message>
<xml_diff>
--- a/thesis/003_ThesisProposal_Draft_123_body.docx
+++ b/thesis/003_ThesisProposal_Draft_123_body.docx
@@ -2608,6 +2608,14 @@
         <w:tblInd w:w="-223.0" w:type="dxa"/>
         <w:tblLayout w:type="fixed"/>
         <w:tblLook w:val="0400"/>
+        <w:tblBorders>
+          <w:top w:val="single" w:color="000000" w:space="0" w:sz="18"/>
+          <w:left w:val="nil" w:color="000000" w:space="0" w:sz="0"/>
+          <w:bottom w:val="single" w:color="000000" w:space="0" w:sz="18"/>
+          <w:right w:val="nil" w:color="000000" w:space="0" w:sz="0"/>
+          <w:insideH w:val="nil" w:color="000000" w:space="0" w:sz="0"/>
+          <w:insideV w:val="nil" w:color="000000" w:space="0" w:sz="0"/>
+        </w:tblBorders>
       </w:tblPr>
       <w:tblGrid>
         <w:gridCol w:w="2769"/>
@@ -2619,8 +2627,7 @@
           <w:tcPr>
             <w:tcW w:w="2769" w:type="dxa"/>
             <w:tcBorders>
-              <w:top w:color="000000" w:space="0" w:sz="18" w:val="single"/>
-              <w:bottom w:color="000000" w:space="0" w:sz="4" w:val="single"/>
+              <w:bottom w:val="single" w:sz="4" w:color="000000" w:space="0"/>
             </w:tcBorders>
           </w:tcPr>
           <w:p>
@@ -2641,8 +2648,7 @@
           <w:tcPr>
             <w:tcW w:w="2769" w:type="dxa"/>
             <w:tcBorders>
-              <w:top w:color="000000" w:space="0" w:sz="18" w:val="single"/>
-              <w:bottom w:color="000000" w:space="0" w:sz="4" w:val="single"/>
+              <w:bottom w:val="single" w:sz="4" w:color="000000" w:space="0"/>
             </w:tcBorders>
           </w:tcPr>
           <w:p>
@@ -2663,8 +2669,7 @@
           <w:tcPr>
             <w:tcW w:w="2769" w:type="dxa"/>
             <w:tcBorders>
-              <w:top w:color="000000" w:space="0" w:sz="18" w:val="single"/>
-              <w:bottom w:color="000000" w:space="0" w:sz="4" w:val="single"/>
+              <w:bottom w:val="single" w:sz="4" w:color="000000" w:space="0"/>
             </w:tcBorders>
           </w:tcPr>
           <w:p>
@@ -2911,7 +2916,7 @@
           <w:tcPr>
             <w:tcW w:w="2769" w:type="dxa"/>
             <w:tcBorders>
-              <w:bottom w:color="000000" w:space="0" w:sz="18" w:val="single"/>
+              <w:bottom w:val="single" w:sz="18" w:color="000000" w:space="0"/>
             </w:tcBorders>
           </w:tcPr>
           <w:p>
@@ -2932,7 +2937,7 @@
           <w:tcPr>
             <w:tcW w:w="2769" w:type="dxa"/>
             <w:tcBorders>
-              <w:bottom w:color="000000" w:space="0" w:sz="18" w:val="single"/>
+              <w:bottom w:val="single" w:sz="18" w:color="000000" w:space="0"/>
             </w:tcBorders>
           </w:tcPr>
           <w:p>
@@ -2953,7 +2958,7 @@
           <w:tcPr>
             <w:tcW w:w="2769" w:type="dxa"/>
             <w:tcBorders>
-              <w:bottom w:color="000000" w:space="0" w:sz="18" w:val="single"/>
+              <w:bottom w:val="single" w:sz="18" w:color="000000" w:space="0"/>
             </w:tcBorders>
           </w:tcPr>
           <w:p>
@@ -3189,6 +3194,14 @@
         <w:tblInd w:w="-223.0" w:type="dxa"/>
         <w:tblLayout w:type="fixed"/>
         <w:tblLook w:val="0400"/>
+        <w:tblBorders>
+          <w:top w:val="single" w:color="000000" w:space="0" w:sz="18"/>
+          <w:left w:val="nil" w:color="000000" w:space="0" w:sz="0"/>
+          <w:bottom w:val="single" w:color="000000" w:space="0" w:sz="18"/>
+          <w:right w:val="nil" w:color="000000" w:space="0" w:sz="0"/>
+          <w:insideH w:val="nil" w:color="000000" w:space="0" w:sz="0"/>
+          <w:insideV w:val="nil" w:color="000000" w:space="0" w:sz="0"/>
+        </w:tblBorders>
       </w:tblPr>
       <w:tblGrid>
         <w:gridCol w:w="1384"/>
@@ -3216,8 +3229,7 @@
         <w:tc>
           <w:tcPr>
             <w:tcBorders>
-              <w:top w:color="000000" w:space="0" w:sz="18" w:val="single"/>
-              <w:bottom w:color="000000" w:space="0" w:sz="4" w:val="single"/>
+              <w:bottom w:val="single" w:sz="4" w:color="000000" w:space="0"/>
             </w:tcBorders>
           </w:tcPr>
           <w:p>
@@ -3250,8 +3262,7 @@
         <w:tc>
           <w:tcPr>
             <w:tcBorders>
-              <w:top w:color="000000" w:space="0" w:sz="18" w:val="single"/>
-              <w:bottom w:color="000000" w:space="0" w:sz="4" w:val="single"/>
+              <w:bottom w:val="single" w:sz="4" w:color="000000" w:space="0"/>
             </w:tcBorders>
           </w:tcPr>
           <w:p>
@@ -3284,8 +3295,7 @@
         <w:tc>
           <w:tcPr>
             <w:tcBorders>
-              <w:top w:color="000000" w:space="0" w:sz="18" w:val="single"/>
-              <w:bottom w:color="000000" w:space="0" w:sz="4" w:val="single"/>
+              <w:bottom w:val="single" w:sz="4" w:color="000000" w:space="0"/>
             </w:tcBorders>
           </w:tcPr>
           <w:p>
@@ -3318,8 +3328,7 @@
         <w:tc>
           <w:tcPr>
             <w:tcBorders>
-              <w:top w:color="000000" w:space="0" w:sz="18" w:val="single"/>
-              <w:bottom w:color="000000" w:space="0" w:sz="4" w:val="single"/>
+              <w:bottom w:val="single" w:sz="4" w:color="000000" w:space="0"/>
             </w:tcBorders>
           </w:tcPr>
           <w:p>
@@ -3352,8 +3361,7 @@
         <w:tc>
           <w:tcPr>
             <w:tcBorders>
-              <w:top w:color="000000" w:space="0" w:sz="18" w:val="single"/>
-              <w:bottom w:color="000000" w:space="0" w:sz="4" w:val="single"/>
+              <w:bottom w:val="single" w:sz="4" w:color="000000" w:space="0"/>
             </w:tcBorders>
           </w:tcPr>
           <w:p>
@@ -3386,8 +3394,7 @@
         <w:tc>
           <w:tcPr>
             <w:tcBorders>
-              <w:top w:color="000000" w:space="0" w:sz="18" w:val="single"/>
-              <w:bottom w:color="000000" w:space="0" w:sz="4" w:val="single"/>
+              <w:bottom w:val="single" w:sz="4" w:color="000000" w:space="0"/>
             </w:tcBorders>
           </w:tcPr>
           <w:p>
@@ -4091,7 +4098,7 @@
         <w:tc>
           <w:tcPr>
             <w:tcBorders>
-              <w:bottom w:color="000000" w:space="0" w:sz="18" w:val="single"/>
+              <w:bottom w:val="single" w:sz="18" w:color="000000" w:space="0"/>
             </w:tcBorders>
           </w:tcPr>
           <w:p>
@@ -4122,7 +4129,7 @@
         <w:tc>
           <w:tcPr>
             <w:tcBorders>
-              <w:bottom w:color="000000" w:space="0" w:sz="18" w:val="single"/>
+              <w:bottom w:val="single" w:sz="18" w:color="000000" w:space="0"/>
             </w:tcBorders>
           </w:tcPr>
           <w:p>
@@ -4153,7 +4160,7 @@
         <w:tc>
           <w:tcPr>
             <w:tcBorders>
-              <w:bottom w:color="000000" w:space="0" w:sz="18" w:val="single"/>
+              <w:bottom w:val="single" w:sz="18" w:color="000000" w:space="0"/>
             </w:tcBorders>
           </w:tcPr>
           <w:p>
@@ -4184,7 +4191,7 @@
         <w:tc>
           <w:tcPr>
             <w:tcBorders>
-              <w:bottom w:color="000000" w:space="0" w:sz="18" w:val="single"/>
+              <w:bottom w:val="single" w:sz="18" w:color="000000" w:space="0"/>
             </w:tcBorders>
           </w:tcPr>
           <w:p>
@@ -4215,7 +4222,7 @@
         <w:tc>
           <w:tcPr>
             <w:tcBorders>
-              <w:bottom w:color="000000" w:space="0" w:sz="18" w:val="single"/>
+              <w:bottom w:val="single" w:sz="18" w:color="000000" w:space="0"/>
             </w:tcBorders>
           </w:tcPr>
           <w:p>
@@ -4246,7 +4253,7 @@
         <w:tc>
           <w:tcPr>
             <w:tcBorders>
-              <w:bottom w:color="000000" w:space="0" w:sz="18" w:val="single"/>
+              <w:bottom w:val="single" w:sz="18" w:color="000000" w:space="0"/>
             </w:tcBorders>
           </w:tcPr>
           <w:p>
@@ -4386,6 +4393,8 @@
         <w:tblW w:w="8355" w:type="dxa"/>
         <w:jc w:val="left"/>
         <w:tblInd w:w="-115" w:type="dxa"/>
+        <w:tblLayout w:type="fixed"/>
+        <w:tblLook w:val="0400"/>
         <w:tblBorders>
           <w:top w:val="single" w:color="000000" w:space="0" w:sz="18"/>
           <w:left w:val="nil" w:color="000000" w:space="0" w:sz="0"/>
@@ -4394,8 +4403,6 @@
           <w:insideH w:val="nil" w:color="000000" w:space="0" w:sz="0"/>
           <w:insideV w:val="nil" w:color="000000" w:space="0" w:sz="0"/>
         </w:tblBorders>
-        <w:tblLayout w:type="fixed"/>
-        <w:tblLook w:val="0400"/>
       </w:tblPr>
       <w:tblGrid>
         <w:gridCol w:w="1661"/>
@@ -5704,9 +5711,7 @@
             <w:tcW w:type="dxa" w:w="1661"/>
             <w:tcBorders>
               <w:top w:val="single" w:sz="4" w:color="000000" w:space="0"/>
-              <w:left w:val="nil"/>
-              <w:bottom w:val="nil"/>
-              <w:right w:val="nil"/>
+              <w:bottom w:val="single" w:sz="18" w:color="000000" w:space="0"/>
             </w:tcBorders>
           </w:tcPr>
           <w:p>
@@ -5728,9 +5733,7 @@
             <w:tcW w:type="dxa" w:w="1661"/>
             <w:tcBorders>
               <w:top w:val="single" w:sz="4" w:color="000000" w:space="0"/>
-              <w:left w:val="nil"/>
-              <w:bottom w:val="nil"/>
-              <w:right w:val="nil"/>
+              <w:bottom w:val="single" w:sz="18" w:color="000000" w:space="0"/>
             </w:tcBorders>
           </w:tcPr>
           <w:p>
@@ -5751,9 +5754,7 @@
             <w:tcW w:type="dxa" w:w="1661"/>
             <w:tcBorders>
               <w:top w:val="single" w:sz="4" w:color="000000" w:space="0"/>
-              <w:left w:val="nil"/>
-              <w:bottom w:val="nil"/>
-              <w:right w:val="nil"/>
+              <w:bottom w:val="single" w:sz="18" w:color="000000" w:space="0"/>
             </w:tcBorders>
           </w:tcPr>
           <w:p>
@@ -5775,9 +5776,7 @@
             <w:tcW w:type="dxa" w:w="1661"/>
             <w:tcBorders>
               <w:top w:val="single" w:sz="4" w:color="000000" w:space="0"/>
-              <w:left w:val="nil"/>
-              <w:bottom w:val="nil"/>
-              <w:right w:val="nil"/>
+              <w:bottom w:val="single" w:sz="18" w:color="000000" w:space="0"/>
             </w:tcBorders>
           </w:tcPr>
           <w:p>
@@ -5799,9 +5798,7 @@
             <w:tcW w:type="dxa" w:w="1661"/>
             <w:tcBorders>
               <w:top w:val="single" w:sz="4" w:color="000000" w:space="0"/>
-              <w:left w:val="nil"/>
-              <w:bottom w:val="nil"/>
-              <w:right w:val="nil"/>
+              <w:bottom w:val="single" w:sz="18" w:color="000000" w:space="0"/>
             </w:tcBorders>
           </w:tcPr>
           <w:p>
@@ -5988,6 +5985,8 @@
         <w:tblW w:w="8355" w:type="dxa"/>
         <w:jc w:val="left"/>
         <w:tblInd w:w="-115" w:type="dxa"/>
+        <w:tblLayout w:type="fixed"/>
+        <w:tblLook w:val="0400"/>
         <w:tblBorders>
           <w:top w:val="single" w:color="000000" w:space="0" w:sz="18"/>
           <w:left w:val="nil" w:color="000000" w:space="0" w:sz="0"/>
@@ -5996,8 +5995,6 @@
           <w:insideH w:val="nil" w:color="000000" w:space="0" w:sz="0"/>
           <w:insideV w:val="nil" w:color="000000" w:space="0" w:sz="0"/>
         </w:tblBorders>
-        <w:tblLayout w:type="fixed"/>
-        <w:tblLook w:val="0400"/>
       </w:tblPr>
       <w:tblGrid>
         <w:gridCol w:w="1661"/>
@@ -6011,10 +6008,7 @@
           <w:tcPr>
             <w:tcW w:type="dxa" w:w="1661"/>
             <w:tcBorders>
-              <w:top w:val="nil"/>
               <w:bottom w:val="single" w:sz="4" w:color="000000" w:space="0"/>
-              <w:left w:val="nil"/>
-              <w:right w:val="nil"/>
             </w:tcBorders>
           </w:tcPr>
           <w:p>
@@ -6027,6 +6021,7 @@
                 <w:b/>
                 <w:sz w:val="18"/>
               </w:rPr>
+              <w:t>Measure</w:t>
             </w:r>
           </w:p>
         </w:tc>
@@ -6034,10 +6029,7 @@
           <w:tcPr>
             <w:tcW w:type="dxa" w:w="1661"/>
             <w:tcBorders>
-              <w:top w:val="nil"/>
               <w:bottom w:val="single" w:sz="4" w:color="000000" w:space="0"/>
-              <w:left w:val="nil"/>
-              <w:right w:val="nil"/>
             </w:tcBorders>
           </w:tcPr>
           <w:p>
@@ -6058,10 +6050,7 @@
           <w:tcPr>
             <w:tcW w:type="dxa" w:w="1661"/>
             <w:tcBorders>
-              <w:top w:val="nil"/>
               <w:bottom w:val="single" w:sz="4" w:color="000000" w:space="0"/>
-              <w:left w:val="nil"/>
-              <w:right w:val="nil"/>
             </w:tcBorders>
           </w:tcPr>
           <w:p>
@@ -6082,10 +6071,7 @@
           <w:tcPr>
             <w:tcW w:type="dxa" w:w="1661"/>
             <w:tcBorders>
-              <w:top w:val="nil"/>
               <w:bottom w:val="single" w:sz="4" w:color="000000" w:space="0"/>
-              <w:left w:val="nil"/>
-              <w:right w:val="nil"/>
             </w:tcBorders>
           </w:tcPr>
           <w:p>
@@ -6106,10 +6092,7 @@
           <w:tcPr>
             <w:tcW w:type="dxa" w:w="1661"/>
             <w:tcBorders>
-              <w:top w:val="nil"/>
               <w:bottom w:val="single" w:sz="4" w:color="000000" w:space="0"/>
-              <w:left w:val="nil"/>
-              <w:right w:val="nil"/>
             </w:tcBorders>
           </w:tcPr>
           <w:p>
@@ -6683,6 +6666,9 @@
         <w:tc>
           <w:tcPr>
             <w:tcW w:type="dxa" w:w="1661"/>
+            <w:tcBorders>
+              <w:bottom w:val="single" w:sz="18" w:color="000000" w:space="0"/>
+            </w:tcBorders>
           </w:tcPr>
           <w:p>
             <w:pPr>
@@ -6701,6 +6687,9 @@
         <w:tc>
           <w:tcPr>
             <w:tcW w:type="dxa" w:w="1661"/>
+            <w:tcBorders>
+              <w:bottom w:val="single" w:sz="18" w:color="000000" w:space="0"/>
+            </w:tcBorders>
           </w:tcPr>
           <w:p>
             <w:pPr>
@@ -6719,6 +6708,9 @@
         <w:tc>
           <w:tcPr>
             <w:tcW w:type="dxa" w:w="1661"/>
+            <w:tcBorders>
+              <w:bottom w:val="single" w:sz="18" w:color="000000" w:space="0"/>
+            </w:tcBorders>
           </w:tcPr>
           <w:p>
             <w:pPr>
@@ -6737,6 +6729,9 @@
         <w:tc>
           <w:tcPr>
             <w:tcW w:type="dxa" w:w="1661"/>
+            <w:tcBorders>
+              <w:bottom w:val="single" w:sz="18" w:color="000000" w:space="0"/>
+            </w:tcBorders>
           </w:tcPr>
           <w:p>
             <w:pPr>
@@ -6755,6 +6750,9 @@
         <w:tc>
           <w:tcPr>
             <w:tcW w:type="dxa" w:w="1661"/>
+            <w:tcBorders>
+              <w:bottom w:val="single" w:sz="18" w:color="000000" w:space="0"/>
+            </w:tcBorders>
           </w:tcPr>
           <w:p>
             <w:pPr>
@@ -6973,6 +6971,14 @@
         <w:tblInd w:w="-223.0" w:type="dxa"/>
         <w:tblLayout w:type="fixed"/>
         <w:tblLook w:val="0400"/>
+        <w:tblBorders>
+          <w:top w:val="single" w:color="000000" w:space="0" w:sz="18"/>
+          <w:left w:val="nil" w:color="000000" w:space="0" w:sz="0"/>
+          <w:bottom w:val="single" w:color="000000" w:space="0" w:sz="18"/>
+          <w:right w:val="nil" w:color="000000" w:space="0" w:sz="0"/>
+          <w:insideH w:val="nil" w:color="000000" w:space="0" w:sz="0"/>
+          <w:insideV w:val="nil" w:color="000000" w:space="0" w:sz="0"/>
+        </w:tblBorders>
       </w:tblPr>
       <w:tblGrid>
         <w:gridCol w:w="2769"/>
@@ -6995,9 +7001,6 @@
           <w:tcPr>
             <w:tcBorders>
               <w:bottom w:val="single" w:sz="4" w:color="000000" w:space="0"/>
-              <w:left w:val="nil"/>
-              <w:right w:val="nil"/>
-              <w:top w:val="nil"/>
             </w:tcBorders>
           </w:tcPr>
           <w:p>
@@ -7022,9 +7025,6 @@
           <w:tcPr>
             <w:tcBorders>
               <w:bottom w:val="single" w:sz="4" w:color="000000" w:space="0"/>
-              <w:left w:val="nil"/>
-              <w:right w:val="nil"/>
-              <w:top w:val="nil"/>
             </w:tcBorders>
           </w:tcPr>
           <w:p>
@@ -7049,9 +7049,6 @@
           <w:tcPr>
             <w:tcBorders>
               <w:bottom w:val="single" w:sz="4" w:color="000000" w:space="0"/>
-              <w:left w:val="nil"/>
-              <w:right w:val="nil"/>
-              <w:top w:val="nil"/>
             </w:tcBorders>
           </w:tcPr>
           <w:p>
@@ -7280,9 +7277,7 @@
           <w:tcPr>
             <w:tcBorders>
               <w:top w:val="single" w:sz="4" w:color="000000" w:space="0"/>
-              <w:left w:val="nil"/>
-              <w:right w:val="nil"/>
-              <w:bottom w:val="nil"/>
+              <w:bottom w:val="single" w:sz="18" w:color="000000" w:space="0"/>
             </w:tcBorders>
           </w:tcPr>
           <w:p>
@@ -7307,9 +7302,7 @@
           <w:tcPr>
             <w:tcBorders>
               <w:top w:val="single" w:sz="4" w:color="000000" w:space="0"/>
-              <w:left w:val="nil"/>
-              <w:right w:val="nil"/>
-              <w:bottom w:val="nil"/>
+              <w:bottom w:val="single" w:sz="18" w:color="000000" w:space="0"/>
             </w:tcBorders>
           </w:tcPr>
           <w:p>
@@ -7334,9 +7327,7 @@
           <w:tcPr>
             <w:tcBorders>
               <w:top w:val="single" w:sz="4" w:color="000000" w:space="0"/>
-              <w:left w:val="nil"/>
-              <w:right w:val="nil"/>
-              <w:bottom w:val="nil"/>
+              <w:bottom w:val="single" w:sz="18" w:color="000000" w:space="0"/>
             </w:tcBorders>
           </w:tcPr>
           <w:p>
@@ -7481,6 +7472,14 @@
         <w:tblInd w:w="-223.0" w:type="dxa"/>
         <w:tblLayout w:type="fixed"/>
         <w:tblLook w:val="0400"/>
+        <w:tblBorders>
+          <w:top w:val="single" w:color="000000" w:space="0" w:sz="18"/>
+          <w:left w:val="nil" w:color="000000" w:space="0" w:sz="0"/>
+          <w:bottom w:val="single" w:color="000000" w:space="0" w:sz="18"/>
+          <w:right w:val="nil" w:color="000000" w:space="0" w:sz="0"/>
+          <w:insideH w:val="nil" w:color="000000" w:space="0" w:sz="0"/>
+          <w:insideV w:val="nil" w:color="000000" w:space="0" w:sz="0"/>
+        </w:tblBorders>
       </w:tblPr>
       <w:tblGrid>
         <w:gridCol w:w="1661"/>
@@ -7506,8 +7505,7 @@
         <w:tc>
           <w:tcPr>
             <w:tcBorders>
-              <w:top w:color="000000" w:space="0" w:sz="18" w:val="single"/>
-              <w:bottom w:color="000000" w:space="0" w:sz="4" w:val="single"/>
+              <w:bottom w:val="single" w:sz="4" w:color="000000" w:space="0"/>
             </w:tcBorders>
           </w:tcPr>
           <w:p>
@@ -7538,8 +7536,7 @@
         <w:tc>
           <w:tcPr>
             <w:tcBorders>
-              <w:top w:color="000000" w:space="0" w:sz="18" w:val="single"/>
-              <w:bottom w:color="000000" w:space="0" w:sz="4" w:val="single"/>
+              <w:bottom w:val="single" w:sz="4" w:color="000000" w:space="0"/>
             </w:tcBorders>
           </w:tcPr>
           <w:p>
@@ -7570,8 +7567,7 @@
         <w:tc>
           <w:tcPr>
             <w:tcBorders>
-              <w:top w:color="000000" w:space="0" w:sz="18" w:val="single"/>
-              <w:bottom w:color="000000" w:space="0" w:sz="4" w:val="single"/>
+              <w:bottom w:val="single" w:sz="4" w:color="000000" w:space="0"/>
             </w:tcBorders>
           </w:tcPr>
           <w:p>
@@ -7602,8 +7598,7 @@
         <w:tc>
           <w:tcPr>
             <w:tcBorders>
-              <w:top w:color="000000" w:space="0" w:sz="18" w:val="single"/>
-              <w:bottom w:color="000000" w:space="0" w:sz="4" w:val="single"/>
+              <w:bottom w:val="single" w:sz="4" w:color="000000" w:space="0"/>
             </w:tcBorders>
           </w:tcPr>
           <w:p>
@@ -7634,8 +7629,7 @@
         <w:tc>
           <w:tcPr>
             <w:tcBorders>
-              <w:top w:color="000000" w:space="0" w:sz="18" w:val="single"/>
-              <w:bottom w:color="000000" w:space="0" w:sz="4" w:val="single"/>
+              <w:bottom w:val="single" w:sz="4" w:color="000000" w:space="0"/>
             </w:tcBorders>
           </w:tcPr>
           <w:p>
@@ -8202,7 +8196,7 @@
         <w:tc>
           <w:tcPr>
             <w:tcBorders>
-              <w:bottom w:color="000000" w:space="0" w:sz="18" w:val="single"/>
+              <w:bottom w:val="single" w:sz="18" w:color="000000" w:space="0"/>
             </w:tcBorders>
           </w:tcPr>
           <w:p>
@@ -8226,7 +8220,7 @@
         <w:tc>
           <w:tcPr>
             <w:tcBorders>
-              <w:bottom w:color="000000" w:space="0" w:sz="18" w:val="single"/>
+              <w:bottom w:val="single" w:sz="18" w:color="000000" w:space="0"/>
             </w:tcBorders>
           </w:tcPr>
           <w:p>
@@ -8250,7 +8244,7 @@
         <w:tc>
           <w:tcPr>
             <w:tcBorders>
-              <w:bottom w:color="000000" w:space="0" w:sz="18" w:val="single"/>
+              <w:bottom w:val="single" w:sz="18" w:color="000000" w:space="0"/>
             </w:tcBorders>
           </w:tcPr>
           <w:p>
@@ -8274,7 +8268,7 @@
         <w:tc>
           <w:tcPr>
             <w:tcBorders>
-              <w:bottom w:color="000000" w:space="0" w:sz="18" w:val="single"/>
+              <w:bottom w:val="single" w:sz="18" w:color="000000" w:space="0"/>
             </w:tcBorders>
           </w:tcPr>
           <w:p>
@@ -8298,7 +8292,7 @@
         <w:tc>
           <w:tcPr>
             <w:tcBorders>
-              <w:bottom w:color="000000" w:space="0" w:sz="18" w:val="single"/>
+              <w:bottom w:val="single" w:sz="18" w:color="000000" w:space="0"/>
             </w:tcBorders>
           </w:tcPr>
           <w:p>

</xml_diff>

<commit_message>
Draft_123_body: move Table 3 discussion prose after table (caption stays with table)
</commit_message>
<xml_diff>
--- a/thesis/003_ThesisProposal_Draft_123_body.docx
+++ b/thesis/003_ThesisProposal_Draft_123_body.docx
@@ -4371,22 +4371,6 @@
         <w:t>Hedge Types by Count and Discipline</w:t>
       </w:r>
     </w:p>
-    <w:p>
-      <w:pPr>
-        <w:spacing w:after="0" w:before="240" w:line="480" w:lineRule="auto"/>
-        <w:ind w:firstLine="720"/>
-        <w:jc w:val="both"/>
-        <w:rPr/>
-      </w:pPr>
-      <w:r>
-        <w:rPr>
-          <w:rFonts w:ascii="Times New Roman" w:hAnsi="Times New Roman" w:eastAsia="Times New Roman" w:cs="Times New Roman"/>
-          <w:b w:val="0"/>
-          <w:sz w:val="22"/>
-        </w:rPr>
-        <w:t>Table 3 reports each hedge type with the forms attested under that type and the counts by discipline (Biology, Veterinary Medicine, Agriculture). Lexical hedges dominate overall (42 tokens), followed by modal verbs (20) and adverbial hedges (3); no clause-level hedges appear. Agriculture is nearly balanced (13 modal vs. 14 lexical). Biology is heavily lexical (20 of 28). Veterinary Medicine’s small total (10) is also mostly lexical (8), with only 2 modal verbs. Among lexical forms, potential is the single most frequent token (19 instances).</w:t>
-      </w:r>
-    </w:p>
     <w:tbl>
       <w:tblPr>
         <w:tblStyle w:val="Table4"/>
@@ -5817,6 +5801,22 @@
         </w:tc>
       </w:tr>
     </w:tbl>
+    <w:p>
+      <w:pPr>
+        <w:spacing w:after="0" w:before="240" w:line="480" w:lineRule="auto"/>
+        <w:ind w:firstLine="720"/>
+        <w:jc w:val="both"/>
+        <w:rPr/>
+      </w:pPr>
+      <w:r>
+        <w:rPr>
+          <w:rFonts w:ascii="Times New Roman" w:hAnsi="Times New Roman" w:eastAsia="Times New Roman" w:cs="Times New Roman"/>
+          <w:b w:val="0"/>
+          <w:sz w:val="22"/>
+        </w:rPr>
+        <w:t>Table 3 reports each hedge type with the forms attested under that type and the counts by discipline (Biology, Veterinary Medicine, Agriculture). Lexical hedges dominate overall (42 tokens), followed by modal verbs (20) and adverbial hedges (3); no clause-level hedges appear. Agriculture is nearly balanced (13 modal vs. 14 lexical). Biology is heavily lexical (20 of 28). Veterinary Medicine’s small total (10) is also mostly lexical (8), with only 2 modal verbs. Among lexical forms, potential is the single most frequent token (19 instances).</w:t>
+      </w:r>
+    </w:p>
     <w:p>
       <w:pPr>
         <w:spacing w:after="0" w:before="0" w:line="480" w:lineRule="auto"/>

</xml_diff>

<commit_message>
Draft_123_body: Table 6 Total row top border (match Table 5)
</commit_message>
<xml_diff>
--- a/thesis/003_ThesisProposal_Draft_123_body.docx
+++ b/thesis/003_ThesisProposal_Draft_123_body.docx
@@ -8196,6 +8196,7 @@
         <w:tc>
           <w:tcPr>
             <w:tcBorders>
+              <w:top w:val="single" w:sz="4" w:space="0" w:color="000000"/>
               <w:bottom w:val="single" w:sz="18" w:color="000000" w:space="0"/>
             </w:tcBorders>
           </w:tcPr>
@@ -8220,6 +8221,7 @@
         <w:tc>
           <w:tcPr>
             <w:tcBorders>
+              <w:top w:val="single" w:sz="4" w:space="0" w:color="000000"/>
               <w:bottom w:val="single" w:sz="18" w:color="000000" w:space="0"/>
             </w:tcBorders>
           </w:tcPr>
@@ -8244,6 +8246,7 @@
         <w:tc>
           <w:tcPr>
             <w:tcBorders>
+              <w:top w:val="single" w:sz="4" w:space="0" w:color="000000"/>
               <w:bottom w:val="single" w:sz="18" w:color="000000" w:space="0"/>
             </w:tcBorders>
           </w:tcPr>
@@ -8268,6 +8271,7 @@
         <w:tc>
           <w:tcPr>
             <w:tcBorders>
+              <w:top w:val="single" w:sz="4" w:space="0" w:color="000000"/>
               <w:bottom w:val="single" w:sz="18" w:color="000000" w:space="0"/>
             </w:tcBorders>
           </w:tcPr>
@@ -8292,6 +8296,7 @@
         <w:tc>
           <w:tcPr>
             <w:tcBorders>
+              <w:top w:val="single" w:sz="4" w:space="0" w:color="000000"/>
               <w:bottom w:val="single" w:sz="18" w:color="000000" w:space="0"/>
             </w:tcBorders>
           </w:tcPr>

</xml_diff>

<commit_message>
Draft_123: replace Methodology Table 1 with Appendix A Decision Rules table
</commit_message>
<xml_diff>
--- a/thesis/003_ThesisProposal_Draft_123_body.docx
+++ b/thesis/003_ThesisProposal_Draft_123_body.docx
@@ -2563,49 +2563,47 @@
       </w:pPr>
       <w:r>
         <w:rPr>
+          <w:sz w:val="22"/>
+        </w:rPr>
+        <w:t>Ambiguous forms may function either as epistemic hedges or as non-epistemic lexical items depending on context. Table 1 summarizes the decision rules applied to the main boundary constructions in this corpus.</w:t>
+      </w:r>
+    </w:p>
+    <w:p>
+      <w:pPr>
+        <w:spacing w:before="120" w:after="0" w:line="480" w:lineRule="auto"/>
+        <w:ind w:firstLine="0"/>
+        <w:jc w:val="center"/>
+      </w:pPr>
+      <w:r>
+        <w:rPr>
+          <w:rFonts w:ascii="Georgia" w:hAnsi="Georgia" w:eastAsia="Georgia"/>
+          <w:b/>
+          <w:sz w:val="22"/>
+        </w:rPr>
+        <w:t>Table 1</w:t>
+      </w:r>
+    </w:p>
+    <w:p>
+      <w:pPr>
+        <w:spacing w:line="480" w:lineRule="auto"/>
+        <w:ind w:firstLine="0"/>
+        <w:jc w:val="center"/>
+      </w:pPr>
+      <w:r>
+        <w:rPr>
           <w:rFonts w:ascii="Georgia" w:hAnsi="Georgia" w:eastAsia="Georgia"/>
           <w:b w:val="0"/>
           <w:sz w:val="22"/>
         </w:rPr>
-        <w:t>Ambiguous forms such as can, potential, indicating, and possibility may function either as epistemic hedges or as non-epistemic lexical items depending on context. Table 1 summarizes how the claim condition and the two removal checks are applied to the main boundary constructions in this corpus.</w:t>
-      </w:r>
-    </w:p>
-    <w:p>
-      <w:pPr>
-        <w:spacing w:before="120" w:after="0" w:line="480" w:lineRule="auto"/>
-        <w:ind w:firstLine="0"/>
-        <w:jc w:val="center"/>
-      </w:pPr>
-      <w:r>
-        <w:rPr>
-          <w:rFonts w:ascii="Georgia" w:hAnsi="Georgia" w:eastAsia="Georgia"/>
-          <w:b/>
-          <w:sz w:val="22"/>
-        </w:rPr>
-        <w:t>Table 1</w:t>
-      </w:r>
-    </w:p>
-    <w:p>
-      <w:pPr>
-        <w:spacing w:line="480" w:lineRule="auto"/>
-        <w:ind w:firstLine="0"/>
-        <w:jc w:val="center"/>
-      </w:pPr>
-      <w:r>
-        <w:rPr>
-          <w:rFonts w:ascii="Georgia" w:hAnsi="Georgia" w:eastAsia="Georgia"/>
-          <w:b w:val="0"/>
-          <w:sz w:val="22"/>
-        </w:rPr>
         <w:t>Decision rules for ambiguous hedge forms.</w:t>
       </w:r>
     </w:p>
     <w:tbl>
       <w:tblPr>
-        <w:tblStyle w:val="Table2"/>
-        <w:tblW w:w="8307.0" w:type="dxa"/>
+        <w:tblStyle w:val="Table4"/>
+        <w:tblW w:w="8355" w:type="dxa"/>
         <w:jc w:val="left"/>
-        <w:tblInd w:w="-223.0" w:type="dxa"/>
+        <w:tblInd w:w="-115" w:type="dxa"/>
         <w:tblLayout w:type="fixed"/>
         <w:tblLook w:val="0400"/>
         <w:tblBorders>
@@ -2627,7 +2625,8 @@
           <w:tcPr>
             <w:tcW w:w="2769" w:type="dxa"/>
             <w:tcBorders>
-              <w:bottom w:val="single" w:sz="4" w:color="000000" w:space="0"/>
+              <w:top w:val="single" w:sz="18" w:space="0" w:color="000000"/>
+              <w:bottom w:val="single" w:sz="4" w:space="0" w:color="000000"/>
             </w:tcBorders>
           </w:tcPr>
           <w:p>
@@ -2640,7 +2639,7 @@
                 <w:b/>
                 <w:sz w:val="18"/>
               </w:rPr>
-              <w:t>Token / construction</w:t>
+              <w:t>Token</w:t>
             </w:r>
           </w:p>
         </w:tc>
@@ -2648,7 +2647,8 @@
           <w:tcPr>
             <w:tcW w:w="2769" w:type="dxa"/>
             <w:tcBorders>
-              <w:bottom w:val="single" w:sz="4" w:color="000000" w:space="0"/>
+              <w:top w:val="single" w:sz="18" w:space="0" w:color="000000"/>
+              <w:bottom w:val="single" w:sz="4" w:space="0" w:color="000000"/>
             </w:tcBorders>
           </w:tcPr>
           <w:p>
@@ -2661,7 +2661,7 @@
                 <w:b/>
                 <w:sz w:val="18"/>
               </w:rPr>
-              <w:t>Hedge when</w:t>
+              <w:t>Hedge When</w:t>
             </w:r>
           </w:p>
         </w:tc>
@@ -2669,7 +2669,8 @@
           <w:tcPr>
             <w:tcW w:w="2769" w:type="dxa"/>
             <w:tcBorders>
-              <w:bottom w:val="single" w:sz="4" w:color="000000" w:space="0"/>
+              <w:top w:val="single" w:sz="18" w:space="0" w:color="000000"/>
+              <w:bottom w:val="single" w:sz="4" w:space="0" w:color="000000"/>
             </w:tcBorders>
           </w:tcPr>
           <w:p>
@@ -2682,7 +2683,7 @@
                 <w:b/>
                 <w:sz w:val="18"/>
               </w:rPr>
-              <w:t>Not a hedge when</w:t>
+              <w:t>Not a Hedge When</w:t>
             </w:r>
           </w:p>
         </w:tc>
@@ -2702,7 +2703,7 @@
                 <w:b w:val="0"/>
                 <w:sz w:val="18"/>
               </w:rPr>
-              <w:t>can + active content verb (e.g., enhance, promote, reduce, help)</w:t>
+              <w:t>suggest / indicate</w:t>
             </w:r>
           </w:p>
         </w:tc>
@@ -2720,7 +2721,7 @@
                 <w:b w:val="0"/>
                 <w:sz w:val="18"/>
               </w:rPr>
-              <w:t>Removing can raises the epistemic weight of a finding-claim (possibility reading).</w:t>
+              <w:t>Expresses uncertainty about a finding or conclusion</w:t>
             </w:r>
           </w:p>
         </w:tc>
@@ -2738,7 +2739,7 @@
                 <w:b w:val="0"/>
                 <w:sz w:val="18"/>
               </w:rPr>
-              <w:t>Marks capability or ability only (false positive).</w:t>
+              <w:t>Introduces a recommendation or action</w:t>
             </w:r>
           </w:p>
         </w:tc>
@@ -2758,7 +2759,7 @@
                 <w:b w:val="0"/>
                 <w:sz w:val="18"/>
               </w:rPr>
-              <w:t>indicating / indicates</w:t>
+              <w:t>suggest / indicate + need for</w:t>
             </w:r>
           </w:p>
         </w:tc>
@@ -2776,7 +2777,7 @@
                 <w:b w:val="0"/>
                 <w:sz w:val="18"/>
               </w:rPr>
-              <w:t>Introduces an inference beyond the operational definition of the result.</w:t>
+              <w:t>Says the evidence suggests a need may exist</w:t>
             </w:r>
           </w:p>
         </w:tc>
@@ -2794,7 +2795,7 @@
                 <w:b w:val="0"/>
                 <w:sz w:val="18"/>
               </w:rPr>
-              <w:t>Restates a field-standard threshold or the operational meaning of the measure (false positive).</w:t>
+              <w:t>Says what should be done or is needed</w:t>
             </w:r>
           </w:p>
         </w:tc>
@@ -2814,7 +2815,7 @@
                 <w:b w:val="0"/>
                 <w:sz w:val="18"/>
               </w:rPr>
-              <w:t>potential + noun</w:t>
+              <w:t>indicated by</w:t>
             </w:r>
           </w:p>
         </w:tc>
@@ -2832,7 +2833,7 @@
                 <w:b w:val="0"/>
                 <w:sz w:val="18"/>
               </w:rPr>
-              <w:t>Results or conclusion frame that qualifies a finding-claim, and the Working Test holds.</w:t>
+              <w:t>Introduces a conclusion drawn from evidence</w:t>
             </w:r>
           </w:p>
         </w:tc>
@@ -2850,7 +2851,7 @@
                 <w:b w:val="0"/>
                 <w:sz w:val="18"/>
               </w:rPr>
-              <w:t>Aim or methods clause (non-claim / topic-naming; fails the claim condition).</w:t>
+              <w:t>Points to evidence for a claim already stated</w:t>
             </w:r>
           </w:p>
         </w:tc>
@@ -2870,7 +2871,7 @@
                 <w:b w:val="0"/>
                 <w:sz w:val="18"/>
               </w:rPr>
-              <w:t>possibility + noun</w:t>
+              <w:t>indicate / indicates that</w:t>
             </w:r>
           </w:p>
         </w:tc>
@@ -2888,7 +2889,7 @@
                 <w:b w:val="0"/>
                 <w:sz w:val="18"/>
               </w:rPr>
-              <w:t>Same claim-condition treatment as potential when the host is a finding-claim.</w:t>
+              <w:t>Introduces an inferential conclusion drawn from analysis</w:t>
             </w:r>
           </w:p>
         </w:tc>
@@ -2906,7 +2907,7 @@
                 <w:b w:val="0"/>
                 <w:sz w:val="18"/>
               </w:rPr>
-              <w:t>Aim or method sentence (non-claim).</w:t>
+              <w:t>Used as a synonym for showed/demonstrated (factive reporting)</w:t>
             </w:r>
           </w:p>
         </w:tc>
@@ -2929,7 +2930,7 @@
                 <w:b w:val="0"/>
                 <w:sz w:val="18"/>
               </w:rPr>
-              <w:t>Multiple hedge-like tokens in one sentence</w:t>
+              <w:t>indicating (participial)</w:t>
             </w:r>
           </w:p>
         </w:tc>
@@ -2950,7 +2951,7 @@
                 <w:b w:val="0"/>
                 <w:sz w:val="18"/>
               </w:rPr>
-              <w:t>Each token is tested on its own host clause under the claim condition and the two removal checks.</w:t>
+              <w:t>Introduces an inference beyond the operational definition of the result</w:t>
             </w:r>
           </w:p>
         </w:tc>
@@ -2971,7 +2972,175 @@
                 <w:b w:val="0"/>
                 <w:sz w:val="18"/>
               </w:rPr>
-              <w:t>A preceding hedge (e.g., suggest) does not determine the function of another token (e.g., can).</w:t>
+              <w:t>Restates the operational meaning of statistical significance</w:t>
+            </w:r>
+          </w:p>
+        </w:tc>
+      </w:tr>
+      <w:tr>
+        <w:tc>
+          <w:tcPr>
+            <w:tcW w:type="dxa" w:w="2769"/>
+          </w:tcPr>
+          <w:p>
+            <w:pPr>
+              <w:spacing w:before="0" w:after="0"/>
+            </w:pPr>
+            <w:r>
+              <w:rPr>
+                <w:b w:val="0"/>
+                <w:sz w:val="18"/>
+              </w:rPr>
+              <w:t>can / may</w:t>
+            </w:r>
+          </w:p>
+        </w:tc>
+        <w:tc>
+          <w:tcPr>
+            <w:tcW w:type="dxa" w:w="2769"/>
+          </w:tcPr>
+          <w:p>
+            <w:pPr>
+              <w:spacing w:before="0" w:after="0"/>
+            </w:pPr>
+            <w:r>
+              <w:rPr>
+                <w:b w:val="0"/>
+                <w:sz w:val="18"/>
+              </w:rPr>
+              <w:t>Expresses possibility</w:t>
+            </w:r>
+          </w:p>
+        </w:tc>
+        <w:tc>
+          <w:tcPr>
+            <w:tcW w:type="dxa" w:w="2769"/>
+          </w:tcPr>
+          <w:p>
+            <w:pPr>
+              <w:spacing w:before="0" w:after="0"/>
+            </w:pPr>
+            <w:r>
+              <w:rPr>
+                <w:b w:val="0"/>
+                <w:sz w:val="18"/>
+              </w:rPr>
+              <w:t>Expresses capability</w:t>
+            </w:r>
+          </w:p>
+        </w:tc>
+      </w:tr>
+      <w:tr>
+        <w:tc>
+          <w:tcPr>
+            <w:tcW w:type="dxa" w:w="2769"/>
+          </w:tcPr>
+          <w:p>
+            <w:pPr>
+              <w:spacing w:before="0" w:after="0"/>
+            </w:pPr>
+            <w:r>
+              <w:rPr>
+                <w:b w:val="0"/>
+                <w:sz w:val="18"/>
+              </w:rPr>
+              <w:t>generally / typically</w:t>
+            </w:r>
+          </w:p>
+        </w:tc>
+        <w:tc>
+          <w:tcPr>
+            <w:tcW w:type="dxa" w:w="2769"/>
+          </w:tcPr>
+          <w:p>
+            <w:pPr>
+              <w:spacing w:before="0" w:after="0"/>
+            </w:pPr>
+            <w:r>
+              <w:rPr>
+                <w:b w:val="0"/>
+                <w:sz w:val="18"/>
+              </w:rPr>
+              <w:t>Qualifies scope</w:t>
+            </w:r>
+          </w:p>
+        </w:tc>
+        <w:tc>
+          <w:tcPr>
+            <w:tcW w:type="dxa" w:w="2769"/>
+          </w:tcPr>
+          <w:p>
+            <w:pPr>
+              <w:spacing w:before="0" w:after="0"/>
+            </w:pPr>
+            <w:r>
+              <w:rPr>
+                <w:b w:val="0"/>
+                <w:sz w:val="18"/>
+              </w:rPr>
+              <w:t>Describes a procedural norm</w:t>
+            </w:r>
+          </w:p>
+        </w:tc>
+      </w:tr>
+      <w:tr>
+        <w:tc>
+          <w:tcPr>
+            <w:tcW w:type="dxa" w:w="2769"/>
+            <w:tcBorders>
+              <w:bottom w:val="single" w:sz="18" w:space="0" w:color="000000"/>
+            </w:tcBorders>
+          </w:tcPr>
+          <w:p>
+            <w:pPr>
+              <w:spacing w:before="0" w:after="0"/>
+            </w:pPr>
+            <w:r>
+              <w:rPr>
+                <w:b w:val="0"/>
+                <w:sz w:val="18"/>
+              </w:rPr>
+              <w:t>appear / seem</w:t>
+            </w:r>
+          </w:p>
+        </w:tc>
+        <w:tc>
+          <w:tcPr>
+            <w:tcW w:type="dxa" w:w="2769"/>
+            <w:tcBorders>
+              <w:bottom w:val="single" w:sz="18" w:space="0" w:color="000000"/>
+            </w:tcBorders>
+          </w:tcPr>
+          <w:p>
+            <w:pPr>
+              <w:spacing w:before="0" w:after="0"/>
+            </w:pPr>
+            <w:r>
+              <w:rPr>
+                <w:b w:val="0"/>
+                <w:sz w:val="18"/>
+              </w:rPr>
+              <w:t>Expresses result uncertainty</w:t>
+            </w:r>
+          </w:p>
+        </w:tc>
+        <w:tc>
+          <w:tcPr>
+            <w:tcW w:type="dxa" w:w="2769"/>
+            <w:tcBorders>
+              <w:bottom w:val="single" w:sz="18" w:space="0" w:color="000000"/>
+            </w:tcBorders>
+          </w:tcPr>
+          <w:p>
+            <w:pPr>
+              <w:spacing w:before="0" w:after="0"/>
+            </w:pPr>
+            <w:r>
+              <w:rPr>
+                <w:b w:val="0"/>
+                <w:sz w:val="18"/>
+              </w:rPr>
+              <w:t>Indicates location</w:t>
             </w:r>
           </w:p>
         </w:tc>

</xml_diff>

<commit_message>
Revert "Draft_123: replace Methodology Table 1 with Appendix A Decision Rules table"
This reverts commit 9854cca2418feb3030aa0a877a7945d8ebfa5fdb.
</commit_message>
<xml_diff>
--- a/thesis/003_ThesisProposal_Draft_123_body.docx
+++ b/thesis/003_ThesisProposal_Draft_123_body.docx
@@ -2563,9 +2563,11 @@
       </w:pPr>
       <w:r>
         <w:rPr>
+          <w:rFonts w:ascii="Georgia" w:hAnsi="Georgia" w:eastAsia="Georgia"/>
+          <w:b w:val="0"/>
           <w:sz w:val="22"/>
         </w:rPr>
-        <w:t>Ambiguous forms may function either as epistemic hedges or as non-epistemic lexical items depending on context. Table 1 summarizes the decision rules applied to the main boundary constructions in this corpus.</w:t>
+        <w:t>Ambiguous forms such as can, potential, indicating, and possibility may function either as epistemic hedges or as non-epistemic lexical items depending on context. Table 1 summarizes how the claim condition and the two removal checks are applied to the main boundary constructions in this corpus.</w:t>
       </w:r>
     </w:p>
     <w:p>
@@ -2600,10 +2602,10 @@
     </w:p>
     <w:tbl>
       <w:tblPr>
-        <w:tblStyle w:val="Table4"/>
-        <w:tblW w:w="8355" w:type="dxa"/>
+        <w:tblStyle w:val="Table2"/>
+        <w:tblW w:w="8307.0" w:type="dxa"/>
         <w:jc w:val="left"/>
-        <w:tblInd w:w="-115" w:type="dxa"/>
+        <w:tblInd w:w="-223.0" w:type="dxa"/>
         <w:tblLayout w:type="fixed"/>
         <w:tblLook w:val="0400"/>
         <w:tblBorders>
@@ -2625,8 +2627,7 @@
           <w:tcPr>
             <w:tcW w:w="2769" w:type="dxa"/>
             <w:tcBorders>
-              <w:top w:val="single" w:sz="18" w:space="0" w:color="000000"/>
-              <w:bottom w:val="single" w:sz="4" w:space="0" w:color="000000"/>
+              <w:bottom w:val="single" w:sz="4" w:color="000000" w:space="0"/>
             </w:tcBorders>
           </w:tcPr>
           <w:p>
@@ -2639,7 +2640,7 @@
                 <w:b/>
                 <w:sz w:val="18"/>
               </w:rPr>
-              <w:t>Token</w:t>
+              <w:t>Token / construction</w:t>
             </w:r>
           </w:p>
         </w:tc>
@@ -2647,8 +2648,7 @@
           <w:tcPr>
             <w:tcW w:w="2769" w:type="dxa"/>
             <w:tcBorders>
-              <w:top w:val="single" w:sz="18" w:space="0" w:color="000000"/>
-              <w:bottom w:val="single" w:sz="4" w:space="0" w:color="000000"/>
+              <w:bottom w:val="single" w:sz="4" w:color="000000" w:space="0"/>
             </w:tcBorders>
           </w:tcPr>
           <w:p>
@@ -2661,7 +2661,7 @@
                 <w:b/>
                 <w:sz w:val="18"/>
               </w:rPr>
-              <w:t>Hedge When</w:t>
+              <w:t>Hedge when</w:t>
             </w:r>
           </w:p>
         </w:tc>
@@ -2669,8 +2669,7 @@
           <w:tcPr>
             <w:tcW w:w="2769" w:type="dxa"/>
             <w:tcBorders>
-              <w:top w:val="single" w:sz="18" w:space="0" w:color="000000"/>
-              <w:bottom w:val="single" w:sz="4" w:space="0" w:color="000000"/>
+              <w:bottom w:val="single" w:sz="4" w:color="000000" w:space="0"/>
             </w:tcBorders>
           </w:tcPr>
           <w:p>
@@ -2683,7 +2682,7 @@
                 <w:b/>
                 <w:sz w:val="18"/>
               </w:rPr>
-              <w:t>Not a Hedge When</w:t>
+              <w:t>Not a hedge when</w:t>
             </w:r>
           </w:p>
         </w:tc>
@@ -2703,7 +2702,7 @@
                 <w:b w:val="0"/>
                 <w:sz w:val="18"/>
               </w:rPr>
-              <w:t>suggest / indicate</w:t>
+              <w:t>can + active content verb (e.g., enhance, promote, reduce, help)</w:t>
             </w:r>
           </w:p>
         </w:tc>
@@ -2721,7 +2720,7 @@
                 <w:b w:val="0"/>
                 <w:sz w:val="18"/>
               </w:rPr>
-              <w:t>Expresses uncertainty about a finding or conclusion</w:t>
+              <w:t>Removing can raises the epistemic weight of a finding-claim (possibility reading).</w:t>
             </w:r>
           </w:p>
         </w:tc>
@@ -2739,7 +2738,7 @@
                 <w:b w:val="0"/>
                 <w:sz w:val="18"/>
               </w:rPr>
-              <w:t>Introduces a recommendation or action</w:t>
+              <w:t>Marks capability or ability only (false positive).</w:t>
             </w:r>
           </w:p>
         </w:tc>
@@ -2759,7 +2758,7 @@
                 <w:b w:val="0"/>
                 <w:sz w:val="18"/>
               </w:rPr>
-              <w:t>suggest / indicate + need for</w:t>
+              <w:t>indicating / indicates</w:t>
             </w:r>
           </w:p>
         </w:tc>
@@ -2777,7 +2776,7 @@
                 <w:b w:val="0"/>
                 <w:sz w:val="18"/>
               </w:rPr>
-              <w:t>Says the evidence suggests a need may exist</w:t>
+              <w:t>Introduces an inference beyond the operational definition of the result.</w:t>
             </w:r>
           </w:p>
         </w:tc>
@@ -2795,7 +2794,7 @@
                 <w:b w:val="0"/>
                 <w:sz w:val="18"/>
               </w:rPr>
-              <w:t>Says what should be done or is needed</w:t>
+              <w:t>Restates a field-standard threshold or the operational meaning of the measure (false positive).</w:t>
             </w:r>
           </w:p>
         </w:tc>
@@ -2815,7 +2814,7 @@
                 <w:b w:val="0"/>
                 <w:sz w:val="18"/>
               </w:rPr>
-              <w:t>indicated by</w:t>
+              <w:t>potential + noun</w:t>
             </w:r>
           </w:p>
         </w:tc>
@@ -2833,7 +2832,7 @@
                 <w:b w:val="0"/>
                 <w:sz w:val="18"/>
               </w:rPr>
-              <w:t>Introduces a conclusion drawn from evidence</w:t>
+              <w:t>Results or conclusion frame that qualifies a finding-claim, and the Working Test holds.</w:t>
             </w:r>
           </w:p>
         </w:tc>
@@ -2851,7 +2850,7 @@
                 <w:b w:val="0"/>
                 <w:sz w:val="18"/>
               </w:rPr>
-              <w:t>Points to evidence for a claim already stated</w:t>
+              <w:t>Aim or methods clause (non-claim / topic-naming; fails the claim condition).</w:t>
             </w:r>
           </w:p>
         </w:tc>
@@ -2871,7 +2870,7 @@
                 <w:b w:val="0"/>
                 <w:sz w:val="18"/>
               </w:rPr>
-              <w:t>indicate / indicates that</w:t>
+              <w:t>possibility + noun</w:t>
             </w:r>
           </w:p>
         </w:tc>
@@ -2889,7 +2888,7 @@
                 <w:b w:val="0"/>
                 <w:sz w:val="18"/>
               </w:rPr>
-              <w:t>Introduces an inferential conclusion drawn from analysis</w:t>
+              <w:t>Same claim-condition treatment as potential when the host is a finding-claim.</w:t>
             </w:r>
           </w:p>
         </w:tc>
@@ -2907,7 +2906,7 @@
                 <w:b w:val="0"/>
                 <w:sz w:val="18"/>
               </w:rPr>
-              <w:t>Used as a synonym for showed/demonstrated (factive reporting)</w:t>
+              <w:t>Aim or method sentence (non-claim).</w:t>
             </w:r>
           </w:p>
         </w:tc>
@@ -2930,7 +2929,7 @@
                 <w:b w:val="0"/>
                 <w:sz w:val="18"/>
               </w:rPr>
-              <w:t>indicating (participial)</w:t>
+              <w:t>Multiple hedge-like tokens in one sentence</w:t>
             </w:r>
           </w:p>
         </w:tc>
@@ -2951,7 +2950,7 @@
                 <w:b w:val="0"/>
                 <w:sz w:val="18"/>
               </w:rPr>
-              <w:t>Introduces an inference beyond the operational definition of the result</w:t>
+              <w:t>Each token is tested on its own host clause under the claim condition and the two removal checks.</w:t>
             </w:r>
           </w:p>
         </w:tc>
@@ -2972,175 +2971,7 @@
                 <w:b w:val="0"/>
                 <w:sz w:val="18"/>
               </w:rPr>
-              <w:t>Restates the operational meaning of statistical significance</w:t>
-            </w:r>
-          </w:p>
-        </w:tc>
-      </w:tr>
-      <w:tr>
-        <w:tc>
-          <w:tcPr>
-            <w:tcW w:type="dxa" w:w="2769"/>
-          </w:tcPr>
-          <w:p>
-            <w:pPr>
-              <w:spacing w:before="0" w:after="0"/>
-            </w:pPr>
-            <w:r>
-              <w:rPr>
-                <w:b w:val="0"/>
-                <w:sz w:val="18"/>
-              </w:rPr>
-              <w:t>can / may</w:t>
-            </w:r>
-          </w:p>
-        </w:tc>
-        <w:tc>
-          <w:tcPr>
-            <w:tcW w:type="dxa" w:w="2769"/>
-          </w:tcPr>
-          <w:p>
-            <w:pPr>
-              <w:spacing w:before="0" w:after="0"/>
-            </w:pPr>
-            <w:r>
-              <w:rPr>
-                <w:b w:val="0"/>
-                <w:sz w:val="18"/>
-              </w:rPr>
-              <w:t>Expresses possibility</w:t>
-            </w:r>
-          </w:p>
-        </w:tc>
-        <w:tc>
-          <w:tcPr>
-            <w:tcW w:type="dxa" w:w="2769"/>
-          </w:tcPr>
-          <w:p>
-            <w:pPr>
-              <w:spacing w:before="0" w:after="0"/>
-            </w:pPr>
-            <w:r>
-              <w:rPr>
-                <w:b w:val="0"/>
-                <w:sz w:val="18"/>
-              </w:rPr>
-              <w:t>Expresses capability</w:t>
-            </w:r>
-          </w:p>
-        </w:tc>
-      </w:tr>
-      <w:tr>
-        <w:tc>
-          <w:tcPr>
-            <w:tcW w:type="dxa" w:w="2769"/>
-          </w:tcPr>
-          <w:p>
-            <w:pPr>
-              <w:spacing w:before="0" w:after="0"/>
-            </w:pPr>
-            <w:r>
-              <w:rPr>
-                <w:b w:val="0"/>
-                <w:sz w:val="18"/>
-              </w:rPr>
-              <w:t>generally / typically</w:t>
-            </w:r>
-          </w:p>
-        </w:tc>
-        <w:tc>
-          <w:tcPr>
-            <w:tcW w:type="dxa" w:w="2769"/>
-          </w:tcPr>
-          <w:p>
-            <w:pPr>
-              <w:spacing w:before="0" w:after="0"/>
-            </w:pPr>
-            <w:r>
-              <w:rPr>
-                <w:b w:val="0"/>
-                <w:sz w:val="18"/>
-              </w:rPr>
-              <w:t>Qualifies scope</w:t>
-            </w:r>
-          </w:p>
-        </w:tc>
-        <w:tc>
-          <w:tcPr>
-            <w:tcW w:type="dxa" w:w="2769"/>
-          </w:tcPr>
-          <w:p>
-            <w:pPr>
-              <w:spacing w:before="0" w:after="0"/>
-            </w:pPr>
-            <w:r>
-              <w:rPr>
-                <w:b w:val="0"/>
-                <w:sz w:val="18"/>
-              </w:rPr>
-              <w:t>Describes a procedural norm</w:t>
-            </w:r>
-          </w:p>
-        </w:tc>
-      </w:tr>
-      <w:tr>
-        <w:tc>
-          <w:tcPr>
-            <w:tcW w:type="dxa" w:w="2769"/>
-            <w:tcBorders>
-              <w:bottom w:val="single" w:sz="18" w:space="0" w:color="000000"/>
-            </w:tcBorders>
-          </w:tcPr>
-          <w:p>
-            <w:pPr>
-              <w:spacing w:before="0" w:after="0"/>
-            </w:pPr>
-            <w:r>
-              <w:rPr>
-                <w:b w:val="0"/>
-                <w:sz w:val="18"/>
-              </w:rPr>
-              <w:t>appear / seem</w:t>
-            </w:r>
-          </w:p>
-        </w:tc>
-        <w:tc>
-          <w:tcPr>
-            <w:tcW w:type="dxa" w:w="2769"/>
-            <w:tcBorders>
-              <w:bottom w:val="single" w:sz="18" w:space="0" w:color="000000"/>
-            </w:tcBorders>
-          </w:tcPr>
-          <w:p>
-            <w:pPr>
-              <w:spacing w:before="0" w:after="0"/>
-            </w:pPr>
-            <w:r>
-              <w:rPr>
-                <w:b w:val="0"/>
-                <w:sz w:val="18"/>
-              </w:rPr>
-              <w:t>Expresses result uncertainty</w:t>
-            </w:r>
-          </w:p>
-        </w:tc>
-        <w:tc>
-          <w:tcPr>
-            <w:tcW w:type="dxa" w:w="2769"/>
-            <w:tcBorders>
-              <w:bottom w:val="single" w:sz="18" w:space="0" w:color="000000"/>
-            </w:tcBorders>
-          </w:tcPr>
-          <w:p>
-            <w:pPr>
-              <w:spacing w:before="0" w:after="0"/>
-            </w:pPr>
-            <w:r>
-              <w:rPr>
-                <w:b w:val="0"/>
-                <w:sz w:val="18"/>
-              </w:rPr>
-              <w:t>Indicates location</w:t>
+              <w:t>A preceding hedge (e.g., suggest) does not determine the function of another token (e.g., can).</w:t>
             </w:r>
           </w:p>
         </w:tc>

</xml_diff>

<commit_message>
Draft_123: Methodology Table 1 = Appendix A Decision Rules table
</commit_message>
<xml_diff>
--- a/thesis/003_ThesisProposal_Draft_123_body.docx
+++ b/thesis/003_ThesisProposal_Draft_123_body.docx
@@ -2563,49 +2563,47 @@
       </w:pPr>
       <w:r>
         <w:rPr>
+          <w:sz w:val="22"/>
+        </w:rPr>
+        <w:t>Ambiguous forms may function either as epistemic hedges or as non-epistemic lexical items depending on context. Table 1 summarizes the decision rules applied to the main boundary constructions in this corpus.</w:t>
+      </w:r>
+    </w:p>
+    <w:p>
+      <w:pPr>
+        <w:spacing w:before="120" w:after="0" w:line="480" w:lineRule="auto"/>
+        <w:ind w:firstLine="0"/>
+        <w:jc w:val="center"/>
+      </w:pPr>
+      <w:r>
+        <w:rPr>
+          <w:rFonts w:ascii="Georgia" w:hAnsi="Georgia" w:eastAsia="Georgia"/>
+          <w:b/>
+          <w:sz w:val="22"/>
+        </w:rPr>
+        <w:t>Table 1</w:t>
+      </w:r>
+    </w:p>
+    <w:p>
+      <w:pPr>
+        <w:spacing w:line="480" w:lineRule="auto"/>
+        <w:ind w:firstLine="0"/>
+        <w:jc w:val="center"/>
+      </w:pPr>
+      <w:r>
+        <w:rPr>
           <w:rFonts w:ascii="Georgia" w:hAnsi="Georgia" w:eastAsia="Georgia"/>
           <w:b w:val="0"/>
           <w:sz w:val="22"/>
         </w:rPr>
-        <w:t>Ambiguous forms such as can, potential, indicating, and possibility may function either as epistemic hedges or as non-epistemic lexical items depending on context. Table 1 summarizes how the claim condition and the two removal checks are applied to the main boundary constructions in this corpus.</w:t>
-      </w:r>
-    </w:p>
-    <w:p>
-      <w:pPr>
-        <w:spacing w:before="120" w:after="0" w:line="480" w:lineRule="auto"/>
-        <w:ind w:firstLine="0"/>
-        <w:jc w:val="center"/>
-      </w:pPr>
-      <w:r>
-        <w:rPr>
-          <w:rFonts w:ascii="Georgia" w:hAnsi="Georgia" w:eastAsia="Georgia"/>
-          <w:b/>
-          <w:sz w:val="22"/>
-        </w:rPr>
-        <w:t>Table 1</w:t>
-      </w:r>
-    </w:p>
-    <w:p>
-      <w:pPr>
-        <w:spacing w:line="480" w:lineRule="auto"/>
-        <w:ind w:firstLine="0"/>
-        <w:jc w:val="center"/>
-      </w:pPr>
-      <w:r>
-        <w:rPr>
-          <w:rFonts w:ascii="Georgia" w:hAnsi="Georgia" w:eastAsia="Georgia"/>
-          <w:b w:val="0"/>
-          <w:sz w:val="22"/>
-        </w:rPr>
         <w:t>Decision rules for ambiguous hedge forms.</w:t>
       </w:r>
     </w:p>
     <w:tbl>
       <w:tblPr>
-        <w:tblStyle w:val="Table2"/>
-        <w:tblW w:w="8307.0" w:type="dxa"/>
+        <w:tblStyle w:val="Table4"/>
+        <w:tblW w:w="8355" w:type="dxa"/>
         <w:jc w:val="left"/>
-        <w:tblInd w:w="-223.0" w:type="dxa"/>
+        <w:tblInd w:w="-115" w:type="dxa"/>
         <w:tblLayout w:type="fixed"/>
         <w:tblLook w:val="0400"/>
         <w:tblBorders>
@@ -2627,7 +2625,8 @@
           <w:tcPr>
             <w:tcW w:w="2769" w:type="dxa"/>
             <w:tcBorders>
-              <w:bottom w:val="single" w:sz="4" w:color="000000" w:space="0"/>
+              <w:top w:val="single" w:sz="18" w:space="0" w:color="000000"/>
+              <w:bottom w:val="single" w:sz="4" w:space="0" w:color="000000"/>
             </w:tcBorders>
           </w:tcPr>
           <w:p>
@@ -2640,7 +2639,7 @@
                 <w:b/>
                 <w:sz w:val="18"/>
               </w:rPr>
-              <w:t>Token / construction</w:t>
+              <w:t>Token</w:t>
             </w:r>
           </w:p>
         </w:tc>
@@ -2648,7 +2647,8 @@
           <w:tcPr>
             <w:tcW w:w="2769" w:type="dxa"/>
             <w:tcBorders>
-              <w:bottom w:val="single" w:sz="4" w:color="000000" w:space="0"/>
+              <w:top w:val="single" w:sz="18" w:space="0" w:color="000000"/>
+              <w:bottom w:val="single" w:sz="4" w:space="0" w:color="000000"/>
             </w:tcBorders>
           </w:tcPr>
           <w:p>
@@ -2661,7 +2661,7 @@
                 <w:b/>
                 <w:sz w:val="18"/>
               </w:rPr>
-              <w:t>Hedge when</w:t>
+              <w:t>Hedge When</w:t>
             </w:r>
           </w:p>
         </w:tc>
@@ -2669,7 +2669,8 @@
           <w:tcPr>
             <w:tcW w:w="2769" w:type="dxa"/>
             <w:tcBorders>
-              <w:bottom w:val="single" w:sz="4" w:color="000000" w:space="0"/>
+              <w:top w:val="single" w:sz="18" w:space="0" w:color="000000"/>
+              <w:bottom w:val="single" w:sz="4" w:space="0" w:color="000000"/>
             </w:tcBorders>
           </w:tcPr>
           <w:p>
@@ -2682,7 +2683,7 @@
                 <w:b/>
                 <w:sz w:val="18"/>
               </w:rPr>
-              <w:t>Not a hedge when</w:t>
+              <w:t>Not a Hedge When</w:t>
             </w:r>
           </w:p>
         </w:tc>
@@ -2702,7 +2703,7 @@
                 <w:b w:val="0"/>
                 <w:sz w:val="18"/>
               </w:rPr>
-              <w:t>can + active content verb (e.g., enhance, promote, reduce, help)</w:t>
+              <w:t>suggest / indicate</w:t>
             </w:r>
           </w:p>
         </w:tc>
@@ -2720,7 +2721,7 @@
                 <w:b w:val="0"/>
                 <w:sz w:val="18"/>
               </w:rPr>
-              <w:t>Removing can raises the epistemic weight of a finding-claim (possibility reading).</w:t>
+              <w:t>Expresses uncertainty about a finding or conclusion</w:t>
             </w:r>
           </w:p>
         </w:tc>
@@ -2738,7 +2739,7 @@
                 <w:b w:val="0"/>
                 <w:sz w:val="18"/>
               </w:rPr>
-              <w:t>Marks capability or ability only (false positive).</w:t>
+              <w:t>Introduces a recommendation or action</w:t>
             </w:r>
           </w:p>
         </w:tc>
@@ -2758,7 +2759,7 @@
                 <w:b w:val="0"/>
                 <w:sz w:val="18"/>
               </w:rPr>
-              <w:t>indicating / indicates</w:t>
+              <w:t>suggest / indicate + need for</w:t>
             </w:r>
           </w:p>
         </w:tc>
@@ -2776,7 +2777,7 @@
                 <w:b w:val="0"/>
                 <w:sz w:val="18"/>
               </w:rPr>
-              <w:t>Introduces an inference beyond the operational definition of the result.</w:t>
+              <w:t>Says the evidence suggests a need may exist</w:t>
             </w:r>
           </w:p>
         </w:tc>
@@ -2794,7 +2795,7 @@
                 <w:b w:val="0"/>
                 <w:sz w:val="18"/>
               </w:rPr>
-              <w:t>Restates a field-standard threshold or the operational meaning of the measure (false positive).</w:t>
+              <w:t>Says what should be done or is needed</w:t>
             </w:r>
           </w:p>
         </w:tc>
@@ -2814,7 +2815,7 @@
                 <w:b w:val="0"/>
                 <w:sz w:val="18"/>
               </w:rPr>
-              <w:t>potential + noun</w:t>
+              <w:t>indicated by</w:t>
             </w:r>
           </w:p>
         </w:tc>
@@ -2832,7 +2833,7 @@
                 <w:b w:val="0"/>
                 <w:sz w:val="18"/>
               </w:rPr>
-              <w:t>Results or conclusion frame that qualifies a finding-claim, and the Working Test holds.</w:t>
+              <w:t>Introduces a conclusion drawn from evidence</w:t>
             </w:r>
           </w:p>
         </w:tc>
@@ -2850,7 +2851,7 @@
                 <w:b w:val="0"/>
                 <w:sz w:val="18"/>
               </w:rPr>
-              <w:t>Aim or methods clause (non-claim / topic-naming; fails the claim condition).</w:t>
+              <w:t>Points to evidence for a claim already stated</w:t>
             </w:r>
           </w:p>
         </w:tc>
@@ -2870,7 +2871,7 @@
                 <w:b w:val="0"/>
                 <w:sz w:val="18"/>
               </w:rPr>
-              <w:t>possibility + noun</w:t>
+              <w:t>indicate / indicates that</w:t>
             </w:r>
           </w:p>
         </w:tc>
@@ -2888,7 +2889,7 @@
                 <w:b w:val="0"/>
                 <w:sz w:val="18"/>
               </w:rPr>
-              <w:t>Same claim-condition treatment as potential when the host is a finding-claim.</w:t>
+              <w:t>Introduces an inferential conclusion drawn from analysis</w:t>
             </w:r>
           </w:p>
         </w:tc>
@@ -2906,7 +2907,7 @@
                 <w:b w:val="0"/>
                 <w:sz w:val="18"/>
               </w:rPr>
-              <w:t>Aim or method sentence (non-claim).</w:t>
+              <w:t>Used as a synonym for showed/demonstrated (factive reporting)</w:t>
             </w:r>
           </w:p>
         </w:tc>
@@ -2929,7 +2930,7 @@
                 <w:b w:val="0"/>
                 <w:sz w:val="18"/>
               </w:rPr>
-              <w:t>Multiple hedge-like tokens in one sentence</w:t>
+              <w:t>indicating (participial)</w:t>
             </w:r>
           </w:p>
         </w:tc>
@@ -2950,7 +2951,7 @@
                 <w:b w:val="0"/>
                 <w:sz w:val="18"/>
               </w:rPr>
-              <w:t>Each token is tested on its own host clause under the claim condition and the two removal checks.</w:t>
+              <w:t>Introduces an inference beyond the operational definition of the result</w:t>
             </w:r>
           </w:p>
         </w:tc>
@@ -2971,7 +2972,175 @@
                 <w:b w:val="0"/>
                 <w:sz w:val="18"/>
               </w:rPr>
-              <w:t>A preceding hedge (e.g., suggest) does not determine the function of another token (e.g., can).</w:t>
+              <w:t>Restates the operational meaning of statistical significance</w:t>
+            </w:r>
+          </w:p>
+        </w:tc>
+      </w:tr>
+      <w:tr>
+        <w:tc>
+          <w:tcPr>
+            <w:tcW w:type="dxa" w:w="2769"/>
+          </w:tcPr>
+          <w:p>
+            <w:pPr>
+              <w:spacing w:before="0" w:after="0"/>
+            </w:pPr>
+            <w:r>
+              <w:rPr>
+                <w:b w:val="0"/>
+                <w:sz w:val="18"/>
+              </w:rPr>
+              <w:t>can / may</w:t>
+            </w:r>
+          </w:p>
+        </w:tc>
+        <w:tc>
+          <w:tcPr>
+            <w:tcW w:type="dxa" w:w="2769"/>
+          </w:tcPr>
+          <w:p>
+            <w:pPr>
+              <w:spacing w:before="0" w:after="0"/>
+            </w:pPr>
+            <w:r>
+              <w:rPr>
+                <w:b w:val="0"/>
+                <w:sz w:val="18"/>
+              </w:rPr>
+              <w:t>Expresses possibility</w:t>
+            </w:r>
+          </w:p>
+        </w:tc>
+        <w:tc>
+          <w:tcPr>
+            <w:tcW w:type="dxa" w:w="2769"/>
+          </w:tcPr>
+          <w:p>
+            <w:pPr>
+              <w:spacing w:before="0" w:after="0"/>
+            </w:pPr>
+            <w:r>
+              <w:rPr>
+                <w:b w:val="0"/>
+                <w:sz w:val="18"/>
+              </w:rPr>
+              <w:t>Expresses capability</w:t>
+            </w:r>
+          </w:p>
+        </w:tc>
+      </w:tr>
+      <w:tr>
+        <w:tc>
+          <w:tcPr>
+            <w:tcW w:type="dxa" w:w="2769"/>
+          </w:tcPr>
+          <w:p>
+            <w:pPr>
+              <w:spacing w:before="0" w:after="0"/>
+            </w:pPr>
+            <w:r>
+              <w:rPr>
+                <w:b w:val="0"/>
+                <w:sz w:val="18"/>
+              </w:rPr>
+              <w:t>generally / typically</w:t>
+            </w:r>
+          </w:p>
+        </w:tc>
+        <w:tc>
+          <w:tcPr>
+            <w:tcW w:type="dxa" w:w="2769"/>
+          </w:tcPr>
+          <w:p>
+            <w:pPr>
+              <w:spacing w:before="0" w:after="0"/>
+            </w:pPr>
+            <w:r>
+              <w:rPr>
+                <w:b w:val="0"/>
+                <w:sz w:val="18"/>
+              </w:rPr>
+              <w:t>Qualifies scope</w:t>
+            </w:r>
+          </w:p>
+        </w:tc>
+        <w:tc>
+          <w:tcPr>
+            <w:tcW w:type="dxa" w:w="2769"/>
+          </w:tcPr>
+          <w:p>
+            <w:pPr>
+              <w:spacing w:before="0" w:after="0"/>
+            </w:pPr>
+            <w:r>
+              <w:rPr>
+                <w:b w:val="0"/>
+                <w:sz w:val="18"/>
+              </w:rPr>
+              <w:t>Describes a procedural norm</w:t>
+            </w:r>
+          </w:p>
+        </w:tc>
+      </w:tr>
+      <w:tr>
+        <w:tc>
+          <w:tcPr>
+            <w:tcW w:type="dxa" w:w="2769"/>
+            <w:tcBorders>
+              <w:bottom w:val="single" w:sz="18" w:space="0" w:color="000000"/>
+            </w:tcBorders>
+          </w:tcPr>
+          <w:p>
+            <w:pPr>
+              <w:spacing w:before="0" w:after="0"/>
+            </w:pPr>
+            <w:r>
+              <w:rPr>
+                <w:b w:val="0"/>
+                <w:sz w:val="18"/>
+              </w:rPr>
+              <w:t>appear / seem</w:t>
+            </w:r>
+          </w:p>
+        </w:tc>
+        <w:tc>
+          <w:tcPr>
+            <w:tcW w:type="dxa" w:w="2769"/>
+            <w:tcBorders>
+              <w:bottom w:val="single" w:sz="18" w:space="0" w:color="000000"/>
+            </w:tcBorders>
+          </w:tcPr>
+          <w:p>
+            <w:pPr>
+              <w:spacing w:before="0" w:after="0"/>
+            </w:pPr>
+            <w:r>
+              <w:rPr>
+                <w:b w:val="0"/>
+                <w:sz w:val="18"/>
+              </w:rPr>
+              <w:t>Expresses result uncertainty</w:t>
+            </w:r>
+          </w:p>
+        </w:tc>
+        <w:tc>
+          <w:tcPr>
+            <w:tcW w:type="dxa" w:w="2769"/>
+            <w:tcBorders>
+              <w:bottom w:val="single" w:sz="18" w:space="0" w:color="000000"/>
+            </w:tcBorders>
+          </w:tcPr>
+          <w:p>
+            <w:pPr>
+              <w:spacing w:before="0" w:after="0"/>
+            </w:pPr>
+            <w:r>
+              <w:rPr>
+                <w:b w:val="0"/>
+                <w:sz w:val="18"/>
+              </w:rPr>
+              <w:t>Indicates location</w:t>
             </w:r>
           </w:p>
         </w:tc>

</xml_diff>

<commit_message>
Draft_123: Part I repertoire-only; move unhedged/assertive to Part II; fix Table 1 mid border; no forward section pointers
</commit_message>
<xml_diff>
--- a/thesis/003_ThesisProposal_Draft_123_body.docx
+++ b/thesis/003_ThesisProposal_Draft_123_body.docx
@@ -2916,9 +2916,7 @@
         <w:tc>
           <w:tcPr>
             <w:tcW w:w="2769" w:type="dxa"/>
-            <w:tcBorders>
-              <w:bottom w:val="single" w:sz="18" w:color="000000" w:space="0"/>
-            </w:tcBorders>
+            <w:tcBorders/>
           </w:tcPr>
           <w:p>
             <w:pPr>
@@ -2937,9 +2935,7 @@
         <w:tc>
           <w:tcPr>
             <w:tcW w:w="2769" w:type="dxa"/>
-            <w:tcBorders>
-              <w:bottom w:val="single" w:sz="18" w:color="000000" w:space="0"/>
-            </w:tcBorders>
+            <w:tcBorders/>
           </w:tcPr>
           <w:p>
             <w:pPr>
@@ -2958,9 +2954,7 @@
         <w:tc>
           <w:tcPr>
             <w:tcW w:w="2769" w:type="dxa"/>
-            <w:tcBorders>
-              <w:bottom w:val="single" w:sz="18" w:color="000000" w:space="0"/>
-            </w:tcBorders>
+            <w:tcBorders/>
           </w:tcPr>
           <w:p>
             <w:pPr>
@@ -6002,81 +5996,6 @@
     </w:p>
     <w:p>
       <w:pPr>
-        <w:spacing w:after="0" w:before="0" w:line="480" w:lineRule="auto"/>
-        <w:ind w:firstLine="720"/>
-        <w:jc w:val="both"/>
-        <w:rPr/>
-      </w:pPr>
-      <w:r>
-        <w:rPr>
-          <w:rFonts w:ascii="Georgia" w:hAnsi="Georgia" w:eastAsia="Georgia" w:cs="Georgia"/>
-          <w:b w:val="0"/>
-          <w:sz w:val="22"/>
-        </w:rPr>
-        <w:t>Alongside the 65 retained epistemic caution hedges (and no politeness/deference tokens), the corpus yielded 65 false positive tokens, hedge-like words that failed the claim condition or both removal checks at Step 2. Those retained-hedge and false-positive totals are set out together in Part III. The false positive total reflects topic-naming potential, recommendations, capability readings, procedural norms, and similar non-claim frames rather than a pre-filter applied before Step 2.</w:t>
-      </w:r>
-    </w:p>
-    <w:p>
-      <w:pPr>
-        <w:spacing w:after="0" w:before="0" w:line="480" w:lineRule="auto"/>
-        <w:ind w:firstLine="720"/>
-        <w:jc w:val="both"/>
-        <w:rPr/>
-      </w:pPr>
-      <w:r>
-        <w:rPr>
-          <w:rFonts w:ascii="Times New Roman" w:hAnsi="Times New Roman" w:cs="Times New Roman" w:eastAsia="Times New Roman"/>
-          <w:b w:val="0"/>
-          <w:sz w:val="22"/>
-          <w:rtl w:val="0"/>
-        </w:rPr>
-        <w:t>Additionally, 14 unhedged claims were identified where caution was warranted but absent. Of these, 9 were generalizations beyond the data [G] and 5 were causal claims stated more strongly than the design alone supports [C]. Twelve of the 14 fall in zero-hedge abstracts. Bare trial results and measured findings are not counted: a hedge could often be inserted there without changing the facts, but caution is not required for routine results reporting. The unhedged-assertion inventory therefore answers how often writers left out caution where it was warranted, not how many assertion slots exist in the corpus.</w:t>
-      </w:r>
-    </w:p>
-    <w:p>
-      <w:pPr>
-        <w:spacing w:after="0" w:before="0" w:line="480" w:lineRule="auto"/>
-        <w:ind w:firstLine="720"/>
-        <w:jc w:val="both"/>
-        <w:rPr/>
-      </w:pPr>
-      <w:r>
-        <w:rPr>
-          <w:rtl w:val="0"/>
-        </w:rPr>
-        <w:t xml:space="preserve">A limited count of assertive reporting forms in the 25 zero-hedge abstracts found recurring items such as </w:t>
-      </w:r>
-      <w:r>
-        <w:rPr>
-          <w:i w:val="1"/>
-          <w:iCs w:val="1"/>
-          <w:rtl w:val="0"/>
-        </w:rPr>
-        <w:t xml:space="preserve">showed, revealed, observed</w:t>
-      </w:r>
-      <w:r>
-        <w:rPr>
-          <w:rtl w:val="0"/>
-        </w:rPr>
-        <w:t xml:space="preserve">, and </w:t>
-      </w:r>
-      <w:r>
-        <w:rPr>
-          <w:i w:val="1"/>
-          <w:iCs w:val="1"/>
-          <w:rtl w:val="0"/>
-        </w:rPr>
-        <w:t xml:space="preserve">highest</w:t>
-      </w:r>
-      <w:r>
-        <w:rPr>
-          <w:rtl w:val="0"/>
-        </w:rPr>
-        <w:t xml:space="preserve"> (79 tokens in total, roughly 3.2 per abstract). These forms are reporting verbs and a superlative rather than a closed booster set. The same count was not run on the 35 hedged abstracts, so it describes the zero-hedge subset only and supports no comparison with hedged abstracts.</w:t>
-      </w:r>
-    </w:p>
-    <w:p>
-      <w:pPr>
         <w:keepNext w:val="1"/>
         <w:spacing w:after="120" w:before="240" w:line="480" w:lineRule="auto"/>
         <w:ind w:firstLine="0"/>
@@ -6971,6 +6890,34 @@
     </w:p>
     <w:p>
       <w:pPr>
+        <w:spacing w:line="480" w:lineRule="auto" w:before="0" w:after="0"/>
+        <w:ind w:firstLine="720"/>
+        <w:jc w:val="both"/>
+      </w:pPr>
+      <w:r>
+        <w:rPr>
+          <w:rFonts w:ascii="Georgia" w:hAnsi="Georgia" w:eastAsia="Georgia"/>
+          <w:sz w:val="22"/>
+        </w:rPr>
+        <w:t>A limited count of assertive reporting forms in the 25 zero-hedge abstracts found recurring items such as showed, revealed, observed, and highest (79 tokens in total, roughly 3.2 per abstract). These forms are reporting verbs and a superlative rather than a closed booster set. The same count was not run on the 35 hedged abstracts, so it describes the zero-hedge subset only and supports no comparison with hedged abstracts.</w:t>
+      </w:r>
+    </w:p>
+    <w:p>
+      <w:pPr>
+        <w:spacing w:line="480" w:lineRule="auto" w:before="0" w:after="0"/>
+        <w:ind w:firstLine="720"/>
+        <w:jc w:val="both"/>
+      </w:pPr>
+      <w:r>
+        <w:rPr>
+          <w:rFonts w:ascii="Georgia" w:hAnsi="Georgia" w:eastAsia="Georgia"/>
+          <w:sz w:val="22"/>
+        </w:rPr>
+        <w:t>Table 4 also records 14 unhedged claims where caution was warranted but absent. Of these, 9 were generalizations beyond the data [G] and 5 were causal claims stated more strongly than the design alone supports [C]. Twelve of the 14 fall in zero-hedge abstracts. Bare trial results and measured findings are not counted: a hedge could often be inserted there without changing the facts, but caution is not required for routine results reporting. The unhedged-assertion inventory therefore answers how often writers left out caution where it was warranted, not how many assertion slots exist in the corpus.</w:t>
+      </w:r>
+    </w:p>
+    <w:p>
+      <w:pPr>
         <w:spacing w:after="0" w:before="0" w:line="480" w:lineRule="auto"/>
         <w:ind w:firstLine="720"/>
         <w:jc w:val="both"/>
@@ -7006,12 +6953,10 @@
       </w:pPr>
       <w:r>
         <w:rPr>
-          <w:rFonts w:ascii="Times New Roman" w:hAnsi="Times New Roman" w:cs="Times New Roman"/>
-          <w:b w:val="0"/>
+          <w:rFonts w:ascii="Georgia" w:hAnsi="Georgia" w:eastAsia="Georgia"/>
           <w:sz w:val="22"/>
-          <w:rtl w:val="0"/>
-        </w:rPr>
-        <w:t>Veterinary Medicine's low density is more difficult to interpret. Many VM abstracts in this corpus reported clinical findings from animal studies (e.g., drug efficacy trials, disease detection, hematological profiling). Outcome-type coding later in this chapter tests the obvious explanation—that VM abstracts mostly report binary results—and finds it insufficient: Biology abstracts with binary results still hedge more than VM binary abstracts. The low rate is better treated as a VM pattern in this institutional corpus, consistent with departmental or supervisory practice, outcome mix, or both, rather than as a general consequence of binary evidence under Salager-Meyer's (1994) claim-responsibility framework.</w:t>
+        </w:rPr>
+        <w:t>Veterinary Medicine's low density is more difficult to interpret. Many VM abstracts in this corpus reported clinical findings from animal studies (e.g., drug efficacy trials, disease detection, hematological profiling). Biology abstracts with binary results still hedge more than VM binary abstracts under the same broad outcome class. The low rate is better treated as a VM pattern in this institutional corpus, consistent with departmental or supervisory practice, outcome mix, or both, rather than as a general consequence of binary evidence under Salager-Meyer's (1994) claim-responsibility framework.</w:t>
       </w:r>
     </w:p>
     <w:p>
@@ -7091,11 +7036,10 @@
       </w:pPr>
       <w:r>
         <w:rPr>
-          <w:rFonts w:ascii="Times New Roman" w:hAnsi="Times New Roman" w:eastAsia="Times New Roman" w:cs="Times New Roman"/>
-          <w:b w:val="0"/>
+          <w:rFonts w:ascii="Georgia" w:hAnsi="Georgia" w:eastAsia="Georgia"/>
           <w:sz w:val="22"/>
         </w:rPr>
-        <w:t>Table 5 summarizes Step 2 outcomes for the coding pool. Of the retained hedges, all 65 were coded as epistemic caution. Politeness/deference is null (0). False positives totaled 65. Those 65 failed the claim condition or both removal checks. The direct comparison is therefore epistemic caution = 65, politeness/deference = 0, false positives = 65.</w:t>
+        <w:t>Table 5 summarizes Step 2 outcomes for the coding pool. Of the retained hedges, all 65 were coded as epistemic caution. Politeness/deference is null (0). False positives totaled 65. Those 65 failed the claim condition or both removal checks. The direct comparison is therefore epistemic caution = 65, politeness/deference = 0, false positives = 65. The false-positive total reflects topic-naming potential, recommendations, capability readings, procedural norms, and similar non-claim frames rather than a pre-filter applied before Step 2.</w:t>
       </w:r>
     </w:p>
     <w:p>

</xml_diff>

<commit_message>
Draft_123: revise and expound RAD Part I for readability (repertoire-only)
</commit_message>
<xml_diff>
--- a/thesis/003_ThesisProposal_Draft_123_body.docx
+++ b/thesis/003_ThesisProposal_Draft_123_body.docx
@@ -4492,11 +4492,24 @@
       </w:pPr>
       <w:r>
         <w:rPr>
-          <w:rFonts w:ascii="Georgia" w:hAnsi="Georgia" w:eastAsia="Georgia" w:cs="Georgia"/>
-          <w:b w:val="0"/>
+          <w:rFonts w:ascii="Georgia" w:hAnsi="Georgia" w:eastAsia="Georgia"/>
           <w:sz w:val="22"/>
         </w:rPr>
-        <w:t>The coding identified 65 hedge tokens across the 60-abstract corpus, or about 1.08 hedges per abstract. That is about half the 2.04 hedges per abstract Hu and Cao (2011) reported for English-medium applied linguistics journals, though the field and writers differ. These tokens were classified into four types following Hyland’s (1998) taxonomy: modal verbs, lexical hedges, adverbial hedges, and clause-level hedges.</w:t>
+        <w:t>Across the 60 abstracts, the coding retained 65 hedge tokens, or about 1.08 hedges per abstract. That rate is lower than the 2.04 hedges per abstract Hu and Cao (2011) reported for English-medium applied-linguistics journal abstracts, though the fields and the writers are not the same. The comparison is useful only as a rough external benchmark: it situates this undergraduate life-science sample as leaner in hedge use than that published linguistics baseline, without claiming an equivalent genre or population.</w:t>
+      </w:r>
+    </w:p>
+    <w:p>
+      <w:pPr>
+        <w:spacing w:line="480" w:lineRule="auto" w:before="0" w:after="0"/>
+        <w:ind w:firstLine="720"/>
+        <w:jc w:val="both"/>
+      </w:pPr>
+      <w:r>
+        <w:rPr>
+          <w:rFonts w:ascii="Georgia" w:hAnsi="Georgia" w:eastAsia="Georgia"/>
+          <w:sz w:val="22"/>
+        </w:rPr>
+        <w:t>Each retained token was classified into one of four formal types following Hyland’s (1998) taxonomy: modal verbs, lexical hedges, adverbial hedges, and clause-level hedges. Table 3 presents the full type inventory for the corpus. For each type it lists the surface forms that appeared and the counts by discipline (Biology, Veterinary Medicine, and Agriculture).</w:t>
       </w:r>
     </w:p>
     <w:p>
@@ -5966,32 +5979,60 @@
     </w:tbl>
     <w:p>
       <w:pPr>
-        <w:spacing w:after="0" w:before="240" w:line="480" w:lineRule="auto"/>
-        <w:ind w:firstLine="720"/>
-        <w:jc w:val="both"/>
-        <w:rPr/>
-      </w:pPr>
-      <w:r>
-        <w:rPr>
-          <w:rFonts w:ascii="Times New Roman" w:hAnsi="Times New Roman" w:eastAsia="Times New Roman" w:cs="Times New Roman"/>
-          <w:b w:val="0"/>
+        <w:spacing w:after="0" w:before="0" w:line="480" w:lineRule="auto"/>
+        <w:ind w:firstLine="720"/>
+        <w:jc w:val="both"/>
+        <w:rPr/>
+      </w:pPr>
+      <w:r>
+        <w:rPr>
+          <w:rFonts w:ascii="Georgia" w:hAnsi="Georgia" w:eastAsia="Georgia"/>
           <w:sz w:val="22"/>
         </w:rPr>
-        <w:t>Table 3 reports each hedge type with the forms attested under that type and the counts by discipline (Biology, Veterinary Medicine, Agriculture). Lexical hedges dominate overall (42 tokens), followed by modal verbs (20) and adverbial hedges (3); no clause-level hedges appear. Agriculture is nearly balanced (13 modal vs. 14 lexical). Biology is heavily lexical (20 of 28). Veterinary Medicine’s small total (10) is also mostly lexical (8), with only 2 modal verbs. Among lexical forms, potential is the single most frequent token (19 instances).</w:t>
-      </w:r>
-    </w:p>
-    <w:p>
-      <w:pPr>
-        <w:spacing w:after="0" w:before="0" w:line="480" w:lineRule="auto"/>
-        <w:ind w:firstLine="720"/>
-        <w:jc w:val="both"/>
-        <w:rPr/>
-      </w:pPr>
-      <w:r>
-        <w:rPr>
-          <w:rtl w:val="0"/>
-        </w:rPr>
-        <w:t xml:space="preserve">The absence of clause-level hedges is consistent with the compressed abstract genre and with the supervised character of the corpus. Science abstracts favor impersonal, compact reporting. Clause-level frames that foreground the writer’s stance (including first-person forms such as “I think” or “in our view,” and more impersonal ones such as “it seems that”) are uncommon in that register. The Scope and Limitations section notes that the texts are ratified products shaped by adviser feedback, so the zero count is better read as a feature of the genre and of departmental practice than as evidence that these writers lack the syntactic means to hedge at clause level. The same restricted range of devices has been observed in other developing-writer corpora (Hyland &amp; Milton, 1997). Here the institutional and genre setting supplies the more proximate explanation.</w:t>
+        <w:t>Lexical hedges account for most of the inventory (42 of 65 tokens). Modal verbs follow with 20 tokens. Adverbial hedges are rare (3 tokens, all potentially, and all in Biology). Clause-level hedges do not appear at all. Within the lexical set, potential is the single most frequent form (19 instances), followed by the suggest family (suggest / suggests / suggesting, 13 instances). Modal use is concentrated in can, could, may, and might, with Agriculture supplying most of the can tokens.</w:t>
+      </w:r>
+    </w:p>
+    <w:p>
+      <w:pPr>
+        <w:spacing w:line="480" w:lineRule="auto" w:before="0" w:after="0"/>
+        <w:ind w:firstLine="720"/>
+        <w:jc w:val="both"/>
+      </w:pPr>
+      <w:r>
+        <w:rPr>
+          <w:rFonts w:ascii="Georgia" w:hAnsi="Georgia" w:eastAsia="Georgia"/>
+          <w:sz w:val="22"/>
+        </w:rPr>
+        <w:t>The three programs do not share the same type mix. Agriculture is nearly balanced between modal verbs (13) and lexical hedges (14). Biology is strongly lexical (20 of 28 tokens), with only five modal verbs. Veterinary Medicine’s total is small (10 tokens) and also mainly lexical (8), with only two modal verbs. In short, the formal repertoire is narrow corpus-wide, and the main cross-program difference at this level is how much of that small repertoire is modal rather than lexical, not whether writers draw on a wide set of hedge types.</w:t>
+      </w:r>
+    </w:p>
+    <w:p>
+      <w:pPr>
+        <w:spacing w:after="0" w:before="0" w:line="480" w:lineRule="auto"/>
+        <w:ind w:firstLine="720"/>
+        <w:jc w:val="both"/>
+        <w:rPr/>
+      </w:pPr>
+      <w:r>
+        <w:rPr>
+          <w:rFonts w:ascii="Georgia" w:hAnsi="Georgia" w:eastAsia="Georgia"/>
+          <w:sz w:val="22"/>
+        </w:rPr>
+        <w:t>The zero count for clause-level hedges fits the abstract as a compressed, impersonal reporting genre. Clause-level frames that put the writer’s stance in the foreground—first-person forms such as I think or in our view, and more impersonal ones such as it seems that—are uncommon in science abstracts. The present texts favor short, result-centered sentences. That register leaves little room for the longer clausal packages in which stance is often packaged in student essays or discussion sections.</w:t>
+      </w:r>
+    </w:p>
+    <w:p>
+      <w:pPr>
+        <w:spacing w:line="480" w:lineRule="auto" w:before="0" w:after="0"/>
+        <w:ind w:firstLine="720"/>
+        <w:jc w:val="both"/>
+      </w:pPr>
+      <w:r>
+        <w:rPr>
+          <w:rFonts w:ascii="Georgia" w:hAnsi="Georgia" w:eastAsia="Georgia"/>
+          <w:sz w:val="22"/>
+        </w:rPr>
+        <w:t>The Scope and Limitations section already notes that these abstracts are ratified products shaped by adviser feedback. Against that background, the absence of clause-level hedges is better read as a feature of the genre and of local supervisory practice than as evidence that the writers lack the syntactic means to hedge at clause level. A similarly restricted range of devices has been reported in other developing-writer corpora (Hyland &amp; Milton, 1997). In this sample, institutional and genre setting is the more proximate account of the formal profile in Table 3.</w:t>
       </w:r>
     </w:p>
     <w:p>

</xml_diff>

<commit_message>
Draft_123: revise and expound RAD Part II for readability (section-internal only)
</commit_message>
<xml_diff>
--- a/thesis/003_ThesisProposal_Draft_123_body.docx
+++ b/thesis/003_ThesisProposal_Draft_123_body.docx
@@ -6070,11 +6070,10 @@
       </w:pPr>
       <w:r>
         <w:rPr>
-          <w:rFonts w:ascii="Times New Roman" w:hAnsi="Times New Roman" w:eastAsia="Times New Roman" w:cs="Times New Roman"/>
-          <w:b w:val="0"/>
+          <w:rFonts w:ascii="Georgia" w:hAnsi="Georgia" w:eastAsia="Georgia"/>
           <w:sz w:val="22"/>
         </w:rPr>
-        <w:t>Cross-disciplinary comparison shows differences in hedge density, driven mainly by Veterinary Medicine’s lower rate. Table 4 presents the hedge counts, false positives, unhedged claims, and normalized frequency (hedges per 100 words) for each discipline.</w:t>
+        <w:t>Part II turns from the formal inventory to how much caution the abstracts actually display. The question is comparative: how dense are retained hedges across Agriculture, Veterinary Medicine, and Biology, and what else sits beside those counts on the same ledger. Table 4 reports, for each discipline, abstract and word totals, retained hedges, hedges per 100 words, zero-hedge abstracts, false positives, and unhedged claims.</w:t>
       </w:r>
     </w:p>
     <w:p>
@@ -6901,145 +6900,134 @@
     </w:tbl>
     <w:p>
       <w:pPr>
-        <w:spacing w:after="0" w:before="240" w:line="480" w:lineRule="auto"/>
-        <w:ind w:firstLine="720"/>
-        <w:jc w:val="both"/>
-        <w:rPr/>
-      </w:pPr>
-      <w:r>
-        <w:rPr>
-          <w:rFonts w:ascii="Times New Roman" w:hAnsi="Times New Roman" w:eastAsia="Times New Roman" w:cs="Times New Roman"/>
-          <w:b w:val="0"/>
-          <w:sz w:val="22"/>
-        </w:rPr>
-        <w:t>Table 4 shows that Biology had a hedge density of 0.62 per 100 words (28 hedges across 4,509 words), followed closely by Agriculture at 0.63 (27 hedges across 4,300 words), and Veterinary Medicine at 0.20 (10 hedges across 5,060 words). The overall corpus density was 0.47 hedges per 100 words. The Agriculture–Biology difference is negligible for practical purposes. Veterinary Medicine remains the low-density corner of the sample.</w:t>
-      </w:r>
-    </w:p>
-    <w:p>
-      <w:pPr>
-        <w:spacing w:after="0" w:before="0" w:line="480" w:lineRule="auto"/>
-        <w:ind w:firstLine="720"/>
-        <w:jc w:val="both"/>
-        <w:rPr/>
-      </w:pPr>
-      <w:r>
-        <w:rPr>
-          <w:rtl w:val="0"/>
-        </w:rPr>
-        <w:t>The number of zero-hedge abstracts makes the same contrast clearer. Of the 60 abstracts, 25 contained zero hedge tokens. Veterinary Medicine accounted for 12 of these zero-hedge abstracts (12 of 20 VM abstracts), Biology for 5 (5 of 20), and Agriculture for 8 (8 of 20). The overrepresentation of Veterinary Medicine in the zero-hedge category is the primary driver of its low density.</w:t>
-      </w:r>
-    </w:p>
-    <w:p>
-      <w:pPr>
-        <w:spacing w:line="480" w:lineRule="auto" w:before="0" w:after="0"/>
-        <w:ind w:firstLine="720"/>
-        <w:jc w:val="both"/>
+        <w:spacing w:after="0" w:before="0" w:line="480" w:lineRule="auto"/>
+        <w:ind w:firstLine="720"/>
+        <w:jc w:val="both"/>
+        <w:rPr/>
       </w:pPr>
       <w:r>
         <w:rPr>
           <w:rFonts w:ascii="Georgia" w:hAnsi="Georgia" w:eastAsia="Georgia"/>
           <w:sz w:val="22"/>
         </w:rPr>
-        <w:t>A limited count of assertive reporting forms in the 25 zero-hedge abstracts found recurring items such as showed, revealed, observed, and highest (79 tokens in total, roughly 3.2 per abstract). These forms are reporting verbs and a superlative rather than a closed booster set. The same count was not run on the 35 hedged abstracts, so it describes the zero-hedge subset only and supports no comparison with hedged abstracts.</w:t>
-      </w:r>
-    </w:p>
-    <w:p>
-      <w:pPr>
-        <w:spacing w:line="480" w:lineRule="auto" w:before="0" w:after="0"/>
-        <w:ind w:firstLine="720"/>
-        <w:jc w:val="both"/>
+        <w:t>On density, Biology and Agriculture sit close together. Biology shows 0.62 hedges per 100 words (28 hedges across 4,509 words). Agriculture shows 0.63 (27 hedges across 4,300 words). Veterinary Medicine sits well below both, at 0.20 (10 hedges across 5,060 words). The corpus as a whole averages 0.47 hedges per 100 words. For practical reading of the table, the Agriculture–Biology gap is negligible. Veterinary Medicine is the low-density corner of the sample.</w:t>
+      </w:r>
+    </w:p>
+    <w:p>
+      <w:pPr>
+        <w:spacing w:after="0" w:before="0" w:line="480" w:lineRule="auto"/>
+        <w:ind w:firstLine="720"/>
+        <w:jc w:val="both"/>
+        <w:rPr/>
       </w:pPr>
       <w:r>
         <w:rPr>
           <w:rFonts w:ascii="Georgia" w:hAnsi="Georgia" w:eastAsia="Georgia"/>
           <w:sz w:val="22"/>
         </w:rPr>
-        <w:t>Table 4 also records 14 unhedged claims where caution was warranted but absent. Of these, 9 were generalizations beyond the data [G] and 5 were causal claims stated more strongly than the design alone supports [C]. Twelve of the 14 fall in zero-hedge abstracts. Bare trial results and measured findings are not counted: a hedge could often be inserted there without changing the facts, but caution is not required for routine results reporting. The unhedged-assertion inventory therefore answers how often writers left out caution where it was warranted, not how many assertion slots exist in the corpus.</w:t>
-      </w:r>
-    </w:p>
-    <w:p>
-      <w:pPr>
-        <w:spacing w:after="0" w:before="0" w:line="480" w:lineRule="auto"/>
-        <w:ind w:firstLine="720"/>
-        <w:jc w:val="both"/>
-        <w:rPr/>
-      </w:pPr>
-      <w:r>
-        <w:rPr>
-          <w:rtl w:val="0"/>
-        </w:rPr>
-        <w:t>Per-abstract hedge distributions reveal substantial skew. Agriculture abstracts averaged 1.35 hedges (median = 1, SD = 1.87, range = 0-8), Biology averaged 1.40 (median = 1, SD = 1.31, range = 0-5), and Veterinary Medicine averaged 0.50 (median = 0, SD = 0.76, range = 0-3). The high standard deviation in Agriculture reflects the influence of Acs2, which contained 8 hedges alone. When Acs2 is excluded as a sensitivity check, Agriculture's density drops to 0.46 per 100 words, nearly tied with Biology's 0.62, so that any Agriculture &gt; Biology ranking is partly driven by a single outlier abstract. Abstracts within a program may share advisers, so observations are not fully independent, and within-discipline spread remains larger than the gaps between means. Removing all 19 instances of “potential” leaves 46 hedges, and Veterinary Medicine’s zero-hedge share rises further. Low density in undergraduate and L2 academic writing is widely reported and is often read as limited stance control rather than as deliberate categorical style (Hyland &amp; Milton, 1997; Qiu et al., 2024). In this PSAU sample, the descriptive contrast is sharpest between Biology and Veterinary Medicine. It is a local English-language pattern in ratified abstracts. Supervised abstracts may absorb program tolerance for soft claims as much as individual rhetorical choice.</w:t>
-      </w:r>
-    </w:p>
-    <w:p>
-      <w:pPr>
-        <w:spacing w:after="0" w:before="0" w:line="480" w:lineRule="auto"/>
-        <w:ind w:firstLine="720"/>
-        <w:jc w:val="both"/>
-        <w:rPr/>
-      </w:pPr>
-      <w:r>
-        <w:rPr>
-          <w:rtl w:val="0"/>
-        </w:rPr>
-        <w:t xml:space="preserve">These frequency patterns partially align with, and partially diverge from, prior work. Afshar et al. (2014) found agriculture using the fewest hedges among expert research articles. Here Agriculture is level with Biology and ranks first only because of Acs2. Without that abstract it falls below Biology, which fits Afshar et al.’s direction better. Expert research articles and undergraduate abstracts are different genres, so the comparison is loose.</w:t>
-      </w:r>
-    </w:p>
-    <w:p>
-      <w:pPr>
-        <w:spacing w:after="0" w:before="0" w:line="480" w:lineRule="auto"/>
-        <w:ind w:firstLine="720"/>
-        <w:jc w:val="both"/>
-        <w:rPr/>
+        <w:t>Zero-hedge abstracts make that contrast sharper. Of the 60 abstracts, 25 contain no retained hedge token. Veterinary Medicine accounts for 12 of those 25 (12 of 20 VM abstracts). Agriculture accounts for 8 (8 of 20), and Biology for 5 (5 of 20). The overrepresentation of Veterinary Medicine in the zero-hedge set is the main structural reason its density stays low: more than half of the VM abstracts contribute nothing to the hedge count, while Biology and Agriculture more often contribute at least one token.</w:t>
+      </w:r>
+    </w:p>
+    <w:p>
+      <w:pPr>
+        <w:spacing w:line="480" w:lineRule="auto" w:before="0" w:after="0"/>
+        <w:ind w:firstLine="720"/>
+        <w:jc w:val="both"/>
       </w:pPr>
       <w:r>
         <w:rPr>
           <w:rFonts w:ascii="Georgia" w:hAnsi="Georgia" w:eastAsia="Georgia"/>
           <w:sz w:val="22"/>
         </w:rPr>
-        <w:t>Veterinary Medicine's low density is more difficult to interpret. Many VM abstracts in this corpus reported clinical findings from animal studies (e.g., drug efficacy trials, disease detection, hematological profiling). Biology abstracts with binary results still hedge more than VM binary abstracts under the same broad outcome class. The low rate is better treated as a VM pattern in this institutional corpus, consistent with departmental or supervisory practice, outcome mix, or both, rather than as a general consequence of binary evidence under Salager-Meyer's (1994) claim-responsibility framework.</w:t>
-      </w:r>
-    </w:p>
-    <w:p>
-      <w:pPr>
-        <w:spacing w:after="0" w:before="0" w:line="480" w:lineRule="auto"/>
-        <w:ind w:firstLine="720"/>
-        <w:jc w:val="both"/>
-        <w:rPr/>
-      </w:pPr>
-      <w:r>
-        <w:rPr>
-          <w:rtl w:val="0"/>
-        </w:rPr>
-        <w:t xml:space="preserve">The false positive distribution also varies by discipline. Biology produced 34 false positives, far more than Agriculture (17) or Veterinary Medicine (14). This is partly because Biology abstracts contain more instances of “</w:t>
-      </w:r>
-      <w:r>
-        <w:rPr>
-          <w:i w:val="1"/>
-          <w:iCs w:val="1"/>
-          <w:rtl w:val="0"/>
-        </w:rPr>
-        <w:t xml:space="preserve">potential</w:t>
-      </w:r>
-      <w:r>
-        <w:rPr>
-          <w:rtl w:val="0"/>
-        </w:rPr>
-        <w:t xml:space="preserve">” in aim statements and “</w:t>
-      </w:r>
-      <w:r>
-        <w:rPr>
-          <w:i w:val="1"/>
-          <w:iCs w:val="1"/>
-          <w:rtl w:val="0"/>
-        </w:rPr>
-        <w:t xml:space="preserve">indicated by</w:t>
-      </w:r>
-      <w:r>
-        <w:rPr>
-          <w:rtl w:val="0"/>
-        </w:rPr>
-        <w:t xml:space="preserve">” evidential pointers, constructions that look like hedges but do not express uncertainty about a claim. The higher count reflects more hedge-like vocabulary in non-hedging functions, not more hedging.</w:t>
+        <w:t>Table 4 also records 14 unhedged claims: statements where caution was warranted but absent. Nine are generalizations beyond the data [G], and five are causal claims stated more strongly than the design alone supports [C]. Twelve of the 14 fall inside zero-hedge abstracts. Bare trial results and measured findings are not counted as unhedged claims. A hedge could often be inserted there without changing the facts, but routine results reporting does not by itself require caution under the coding scheme. The inventory therefore answers how often writers omitted warranted caution, not how many assertive slots the corpus contains overall.</w:t>
+      </w:r>
+    </w:p>
+    <w:p>
+      <w:pPr>
+        <w:spacing w:line="480" w:lineRule="auto" w:before="0" w:after="0"/>
+        <w:ind w:firstLine="720"/>
+        <w:jc w:val="both"/>
+      </w:pPr>
+      <w:r>
+        <w:rPr>
+          <w:rFonts w:ascii="Georgia" w:hAnsi="Georgia" w:eastAsia="Georgia"/>
+          <w:sz w:val="22"/>
+        </w:rPr>
+        <w:t>A limited count of assertive reporting forms in the 25 zero-hedge abstracts found recurring items such as showed, revealed, observed, and highest (79 tokens in total, about 3.2 per abstract). These are reporting verbs and a superlative, not a closed booster checklist. The same count was not run on the 35 abstracts that contain at least one hedge, so the figure describes the zero-hedge subset only. It shows how those abstracts often report findings in direct, unqualified wording. It does not support a comparison with hedged abstracts.</w:t>
+      </w:r>
+    </w:p>
+    <w:p>
+      <w:pPr>
+        <w:spacing w:after="0" w:before="0" w:line="480" w:lineRule="auto"/>
+        <w:ind w:firstLine="720"/>
+        <w:jc w:val="both"/>
+        <w:rPr/>
+      </w:pPr>
+      <w:r>
+        <w:rPr>
+          <w:rFonts w:ascii="Georgia" w:hAnsi="Georgia" w:eastAsia="Georgia"/>
+          <w:sz w:val="22"/>
+        </w:rPr>
+        <w:t>Per-abstract counts are skewed, especially in Agriculture. Agriculture averages 1.35 hedges per abstract (median 1, range 0–8). Biology averages 1.40 (median 1, range 0–5). Veterinary Medicine averages 0.50 (median 0, range 0–3). Agriculture’s high standard deviation (1.87) is driven largely by Acs2, which alone carries 8 hedges. When Acs2 is set aside as a sensitivity check, Agriculture’s density falls to 0.46 hedges per 100 words and no longer sits above Biology. Any simple ranking that places Agriculture above Biology on density is therefore partly an Acs2 effect.</w:t>
+      </w:r>
+    </w:p>
+    <w:p>
+      <w:pPr>
+        <w:spacing w:line="480" w:lineRule="auto" w:before="0" w:after="0"/>
+        <w:ind w:firstLine="720"/>
+        <w:jc w:val="both"/>
+      </w:pPr>
+      <w:r>
+        <w:rPr>
+          <w:rFonts w:ascii="Georgia" w:hAnsi="Georgia" w:eastAsia="Georgia"/>
+          <w:sz w:val="22"/>
+        </w:rPr>
+        <w:t>Two further cautions apply to reading the discipline means. Abstracts within a program may share advisers, so the observations are not fully independent, and within-discipline spread remains larger than the gaps between means. Removing all 19 instances of potential leaves 46 hedges in the corpus, and Veterinary Medicine’s share of zero-hedge abstracts rises further. Low hedge density is widely reported in undergraduate and L2 academic writing (Hyland &amp; Milton, 1997; Qiu et al., 2024). In this PSAU sample the sharpest descriptive contrast is between Biology and Veterinary Medicine. It is a local pattern in ratified English abstracts. Supervised texts may reflect program tolerance for soft claims as much as individual rhetorical choice.</w:t>
+      </w:r>
+    </w:p>
+    <w:p>
+      <w:pPr>
+        <w:spacing w:after="0" w:before="0" w:line="480" w:lineRule="auto"/>
+        <w:ind w:firstLine="720"/>
+        <w:jc w:val="both"/>
+        <w:rPr/>
+      </w:pPr>
+      <w:r>
+        <w:rPr>
+          <w:rFonts w:ascii="Georgia" w:hAnsi="Georgia" w:eastAsia="Georgia"/>
+          <w:sz w:val="22"/>
+        </w:rPr>
+        <w:t>The frequency pattern only partly matches prior cross-disciplinary work. Afshar et al. (2014) found agriculture using the fewest hedges among expert research articles. Here Agriculture is level with Biology in the full sample and ranks first only because of Acs2. Without that abstract it falls below Biology, which sits closer to Afshar et al.’s direction. Expert research articles and undergraduate abstracts are different genres, so the comparison stays loose. What the present table can support is a local ranking under one institutional coding scheme, not a general claim about agricultural writing worldwide.</w:t>
+      </w:r>
+    </w:p>
+    <w:p>
+      <w:pPr>
+        <w:spacing w:after="0" w:before="0" w:line="480" w:lineRule="auto"/>
+        <w:ind w:firstLine="720"/>
+        <w:jc w:val="both"/>
+        <w:rPr/>
+      </w:pPr>
+      <w:r>
+        <w:rPr>
+          <w:rFonts w:ascii="Georgia" w:hAnsi="Georgia" w:eastAsia="Georgia"/>
+          <w:sz w:val="22"/>
+        </w:rPr>
+        <w:t>Veterinary Medicine’s low density needs a careful reading. Many VM abstracts in this corpus report clinical findings from animal studies, including drug-efficacy trials, disease detection, and hematological profiling. Binary or presence-style results are common in that set, but they do not fully explain the gap: Biology abstracts with binary results still show more epistemic softening than VM abstracts with a similar results style. The low rate is better treated as a VM pattern in this institutional corpus. It is consistent with departmental or supervisory practice, with outcome mix, or with both. It should not be read as a general rule that binary evidence needs no hedge under Salager-Meyer’s (1994) claim-responsibility account.</w:t>
+      </w:r>
+    </w:p>
+    <w:p>
+      <w:pPr>
+        <w:spacing w:after="0" w:before="0" w:line="480" w:lineRule="auto"/>
+        <w:ind w:firstLine="720"/>
+        <w:jc w:val="both"/>
+        <w:rPr/>
+      </w:pPr>
+      <w:r>
+        <w:rPr>
+          <w:rFonts w:ascii="Georgia" w:hAnsi="Georgia" w:eastAsia="Georgia"/>
+          <w:sz w:val="22"/>
+        </w:rPr>
+        <w:t>False positives also differ by discipline, and the direction is not the same as for retained hedges. Biology produced 34 false positives, compared with 17 in Agriculture and 14 in Veterinary Medicine. The Biology excess is tied in part to more instances of potential in aim statements and indicated by as an evidential pointer: forms that resemble hedges in surface shape but do not mark uncertainty about a claim under the coding rules. A higher false-positive count therefore means more hedge-like vocabulary in non-hedging roles, not more hedging. Read with Table 4, Biology is both relatively dense in retained hedges and rich in rejected lookalikes, while Veterinary Medicine is low on both retained hedges and false positives.</w:t>
       </w:r>
     </w:p>
     <w:p>

</xml_diff>